<commit_message>
Add `revenueForSection` field and corresponding logic to Event invoice templates
Introduced new `revenueForSection` and `revenueForSectionInfoText` fields in `tl_calendar_events_instructor_invoice.php`. Updated Event.php to handle placeholders for these fields in DOCX templates. The fields allow tracking section-specific revenue with optional descriptions.

https://github.com/jonasmueller1/sac-pilatus-website/issues/141
</commit_message>
<xml_diff>
--- a/contao/templates/docx/event_invoice_tour.docx
+++ b/contao/templates/docx/event_invoice_tour.docx
@@ -1,6 +1,6 @@
 
 <file path=word/document.xml><?xml version="1.0" encoding="utf-8"?>
-<w:document xmlns:wpc="http://schemas.microsoft.com/office/word/2010/wordprocessingCanvas" xmlns:cx="http://schemas.microsoft.com/office/drawing/2014/chartex" xmlns:cx1="http://schemas.microsoft.com/office/drawing/2015/9/8/chartex" xmlns:cx2="http://schemas.microsoft.com/office/drawing/2015/10/21/chartex" xmlns:cx3="http://schemas.microsoft.com/office/drawing/2016/5/9/chartex" xmlns:cx4="http://schemas.microsoft.com/office/drawing/2016/5/10/chartex" xmlns:cx5="http://schemas.microsoft.com/office/drawing/2016/5/11/chartex" xmlns:cx6="http://schemas.microsoft.com/office/drawing/2016/5/12/chartex" xmlns:cx7="http://schemas.microsoft.com/office/drawing/2016/5/13/chartex" xmlns:cx8="http://schemas.microsoft.com/office/drawing/2016/5/14/chartex" xmlns:mc="http://schemas.openxmlformats.org/markup-compatibility/2006" xmlns:aink="http://schemas.microsoft.com/office/drawing/2016/ink" xmlns:am3d="http://schemas.microsoft.com/office/drawing/2017/model3d" xmlns:o="urn:schemas-microsoft-com:office:office" xmlns:oel="http://schemas.microsoft.com/office/2019/extlst" xmlns:r="http://schemas.openxmlformats.org/officeDocument/2006/relationships" xmlns:m="http://schemas.openxmlformats.org/officeDocument/2006/math" xmlns:v="urn:schemas-microsoft-com:vml" xmlns:wp14="http://schemas.microsoft.com/office/word/2010/wordprocessingDrawing" xmlns:wp="http://schemas.openxmlformats.org/drawingml/2006/wordprocessingDrawing" xmlns:w10="urn:schemas-microsoft-com:office:word" xmlns:w="http://schemas.openxmlformats.org/wordprocessingml/2006/main" xmlns:w14="http://schemas.microsoft.com/office/word/2010/wordml" xmlns:w15="http://schemas.microsoft.com/office/word/2012/wordml" xmlns:w16cex="http://schemas.microsoft.com/office/word/2018/wordml/cex" xmlns:w16cid="http://schemas.microsoft.com/office/word/2016/wordml/cid" xmlns:w16="http://schemas.microsoft.com/office/word/2018/wordml" xmlns:w16du="http://schemas.microsoft.com/office/word/2023/wordml/word16du" xmlns:w16sdtdh="http://schemas.microsoft.com/office/word/2020/wordml/sdtdatahash" xmlns:w16se="http://schemas.microsoft.com/office/word/2015/wordml/symex" xmlns:wpg="http://schemas.microsoft.com/office/word/2010/wordprocessingGroup" xmlns:wpi="http://schemas.microsoft.com/office/word/2010/wordprocessingInk" xmlns:wne="http://schemas.microsoft.com/office/word/2006/wordml" xmlns:wps="http://schemas.microsoft.com/office/word/2010/wordprocessingShape" mc:Ignorable="w14 w15 w16se w16cid w16 w16cex w16sdtdh w16du wp14">
+<w:document xmlns:wpc="http://schemas.microsoft.com/office/word/2010/wordprocessingCanvas" xmlns:cx="http://schemas.microsoft.com/office/drawing/2014/chartex" xmlns:cx1="http://schemas.microsoft.com/office/drawing/2015/9/8/chartex" xmlns:cx2="http://schemas.microsoft.com/office/drawing/2015/10/21/chartex" xmlns:cx3="http://schemas.microsoft.com/office/drawing/2016/5/9/chartex" xmlns:cx4="http://schemas.microsoft.com/office/drawing/2016/5/10/chartex" xmlns:cx5="http://schemas.microsoft.com/office/drawing/2016/5/11/chartex" xmlns:cx6="http://schemas.microsoft.com/office/drawing/2016/5/12/chartex" xmlns:cx7="http://schemas.microsoft.com/office/drawing/2016/5/13/chartex" xmlns:cx8="http://schemas.microsoft.com/office/drawing/2016/5/14/chartex" xmlns:mc="http://schemas.openxmlformats.org/markup-compatibility/2006" xmlns:aink="http://schemas.microsoft.com/office/drawing/2016/ink" xmlns:am3d="http://schemas.microsoft.com/office/drawing/2017/model3d" xmlns:o="urn:schemas-microsoft-com:office:office" xmlns:oel="http://schemas.microsoft.com/office/2019/extlst" xmlns:r="http://schemas.openxmlformats.org/officeDocument/2006/relationships" xmlns:m="http://schemas.openxmlformats.org/officeDocument/2006/math" xmlns:v="urn:schemas-microsoft-com:vml" xmlns:wp14="http://schemas.microsoft.com/office/word/2010/wordprocessingDrawing" xmlns:wp="http://schemas.openxmlformats.org/drawingml/2006/wordprocessingDrawing" xmlns:w10="urn:schemas-microsoft-com:office:word" xmlns:w="http://schemas.openxmlformats.org/wordprocessingml/2006/main" xmlns:w14="http://schemas.microsoft.com/office/word/2010/wordml" xmlns:w15="http://schemas.microsoft.com/office/word/2012/wordml" xmlns:w16cex="http://schemas.microsoft.com/office/word/2018/wordml/cex" xmlns:w16cid="http://schemas.microsoft.com/office/word/2016/wordml/cid" xmlns:w16="http://schemas.microsoft.com/office/word/2018/wordml" xmlns:w16du="http://schemas.microsoft.com/office/word/2023/wordml/word16du" xmlns:w16sdtdh="http://schemas.microsoft.com/office/word/2020/wordml/sdtdatahash" xmlns:w16sdtfl="http://schemas.microsoft.com/office/word/2024/wordml/sdtformatlock" xmlns:w16se="http://schemas.microsoft.com/office/word/2015/wordml/symex" xmlns:wpg="http://schemas.microsoft.com/office/word/2010/wordprocessingGroup" xmlns:wpi="http://schemas.microsoft.com/office/word/2010/wordprocessingInk" xmlns:wne="http://schemas.microsoft.com/office/word/2006/wordml" xmlns:wps="http://schemas.microsoft.com/office/word/2010/wordprocessingShape" mc:Ignorable="w14 w15 w16se w16cid w16 w16cex w16sdtdh w16sdtfl w16du wp14">
   <w:body>
     <w:p>
       <w:pPr>
@@ -97,7 +97,6 @@
               <w:bottom w:val="nil"/>
               <w:right w:val="nil"/>
             </w:tcBorders>
-            <w:shd w:val="clear" w:color="auto" w:fill="auto"/>
           </w:tcPr>
           <w:p>
             <w:pPr>
@@ -127,38 +126,21 @@
               <w:bottom w:val="nil"/>
               <w:right w:val="nil"/>
             </w:tcBorders>
-            <w:shd w:val="clear" w:color="auto" w:fill="auto"/>
-          </w:tcPr>
-          <w:p>
-            <w:pPr>
-              <w:spacing w:after="0" w:line="240" w:lineRule="auto"/>
-              <w:rPr>
-                <w:sz w:val="20"/>
-                <w:szCs w:val="20"/>
-              </w:rPr>
-            </w:pPr>
-            <w:r>
-              <w:rPr>
-                <w:sz w:val="20"/>
-                <w:szCs w:val="20"/>
-              </w:rPr>
-              <w:t>${</w:t>
-            </w:r>
-            <w:proofErr w:type="spellStart"/>
-            <w:r>
-              <w:rPr>
-                <w:sz w:val="20"/>
-                <w:szCs w:val="20"/>
-              </w:rPr>
-              <w:t>eventTitle</w:t>
-            </w:r>
-            <w:proofErr w:type="spellEnd"/>
-            <w:r>
-              <w:rPr>
-                <w:sz w:val="20"/>
-                <w:szCs w:val="20"/>
-              </w:rPr>
-              <w:t>}</w:t>
+          </w:tcPr>
+          <w:p>
+            <w:pPr>
+              <w:spacing w:after="0" w:line="240" w:lineRule="auto"/>
+              <w:rPr>
+                <w:sz w:val="20"/>
+                <w:szCs w:val="20"/>
+              </w:rPr>
+            </w:pPr>
+            <w:r>
+              <w:rPr>
+                <w:sz w:val="20"/>
+                <w:szCs w:val="20"/>
+              </w:rPr>
+              <w:t>${eventTitle}</w:t>
             </w:r>
           </w:p>
         </w:tc>
@@ -171,7 +153,6 @@
               <w:bottom w:val="nil"/>
               <w:right w:val="nil"/>
             </w:tcBorders>
-            <w:shd w:val="clear" w:color="auto" w:fill="auto"/>
           </w:tcPr>
           <w:p>
             <w:pPr>
@@ -201,38 +182,21 @@
               <w:bottom w:val="nil"/>
               <w:right w:val="nil"/>
             </w:tcBorders>
-            <w:shd w:val="clear" w:color="auto" w:fill="auto"/>
-          </w:tcPr>
-          <w:p>
-            <w:pPr>
-              <w:spacing w:after="0" w:line="240" w:lineRule="auto"/>
-              <w:rPr>
-                <w:sz w:val="20"/>
-                <w:szCs w:val="20"/>
-              </w:rPr>
-            </w:pPr>
-            <w:r>
-              <w:rPr>
-                <w:sz w:val="20"/>
-                <w:szCs w:val="20"/>
-              </w:rPr>
-              <w:t>${</w:t>
-            </w:r>
-            <w:proofErr w:type="spellStart"/>
-            <w:r>
-              <w:rPr>
-                <w:sz w:val="20"/>
-                <w:szCs w:val="20"/>
-              </w:rPr>
-              <w:t>eventTransport</w:t>
-            </w:r>
-            <w:proofErr w:type="spellEnd"/>
-            <w:r>
-              <w:rPr>
-                <w:sz w:val="20"/>
-                <w:szCs w:val="20"/>
-              </w:rPr>
-              <w:t>}</w:t>
+          </w:tcPr>
+          <w:p>
+            <w:pPr>
+              <w:spacing w:after="0" w:line="240" w:lineRule="auto"/>
+              <w:rPr>
+                <w:sz w:val="20"/>
+                <w:szCs w:val="20"/>
+              </w:rPr>
+            </w:pPr>
+            <w:r>
+              <w:rPr>
+                <w:sz w:val="20"/>
+                <w:szCs w:val="20"/>
+              </w:rPr>
+              <w:t>${eventTransport}</w:t>
             </w:r>
           </w:p>
         </w:tc>
@@ -247,7 +211,6 @@
               <w:bottom w:val="nil"/>
               <w:right w:val="nil"/>
             </w:tcBorders>
-            <w:shd w:val="clear" w:color="auto" w:fill="auto"/>
           </w:tcPr>
           <w:p>
             <w:pPr>
@@ -277,38 +240,21 @@
               <w:bottom w:val="nil"/>
               <w:right w:val="nil"/>
             </w:tcBorders>
-            <w:shd w:val="clear" w:color="auto" w:fill="auto"/>
-          </w:tcPr>
-          <w:p>
-            <w:pPr>
-              <w:spacing w:after="0" w:line="240" w:lineRule="auto"/>
-              <w:rPr>
-                <w:sz w:val="20"/>
-                <w:szCs w:val="20"/>
-              </w:rPr>
-            </w:pPr>
-            <w:r>
-              <w:rPr>
-                <w:sz w:val="20"/>
-                <w:szCs w:val="20"/>
-              </w:rPr>
-              <w:t>${</w:t>
-            </w:r>
-            <w:proofErr w:type="spellStart"/>
-            <w:r>
-              <w:rPr>
-                <w:sz w:val="20"/>
-                <w:szCs w:val="20"/>
-              </w:rPr>
-              <w:t>eventDates</w:t>
-            </w:r>
-            <w:proofErr w:type="spellEnd"/>
-            <w:r>
-              <w:rPr>
-                <w:sz w:val="20"/>
-                <w:szCs w:val="20"/>
-              </w:rPr>
-              <w:t>}</w:t>
+          </w:tcPr>
+          <w:p>
+            <w:pPr>
+              <w:spacing w:after="0" w:line="240" w:lineRule="auto"/>
+              <w:rPr>
+                <w:sz w:val="20"/>
+                <w:szCs w:val="20"/>
+              </w:rPr>
+            </w:pPr>
+            <w:r>
+              <w:rPr>
+                <w:sz w:val="20"/>
+                <w:szCs w:val="20"/>
+              </w:rPr>
+              <w:t>${eventDates}</w:t>
             </w:r>
           </w:p>
         </w:tc>
@@ -321,7 +267,6 @@
               <w:bottom w:val="nil"/>
               <w:right w:val="nil"/>
             </w:tcBorders>
-            <w:shd w:val="clear" w:color="auto" w:fill="auto"/>
           </w:tcPr>
           <w:p>
             <w:pPr>
@@ -351,38 +296,21 @@
               <w:bottom w:val="nil"/>
               <w:right w:val="nil"/>
             </w:tcBorders>
-            <w:shd w:val="clear" w:color="auto" w:fill="auto"/>
-          </w:tcPr>
-          <w:p>
-            <w:pPr>
-              <w:spacing w:after="0" w:line="240" w:lineRule="auto"/>
-              <w:rPr>
-                <w:sz w:val="20"/>
-                <w:szCs w:val="20"/>
-              </w:rPr>
-            </w:pPr>
-            <w:r>
-              <w:rPr>
-                <w:sz w:val="20"/>
-                <w:szCs w:val="20"/>
-              </w:rPr>
-              <w:t>${</w:t>
-            </w:r>
-            <w:proofErr w:type="spellStart"/>
-            <w:r>
-              <w:rPr>
-                <w:sz w:val="20"/>
-                <w:szCs w:val="20"/>
-              </w:rPr>
-              <w:t>eventDuration</w:t>
-            </w:r>
-            <w:proofErr w:type="spellEnd"/>
-            <w:r>
-              <w:rPr>
-                <w:sz w:val="20"/>
-                <w:szCs w:val="20"/>
-              </w:rPr>
-              <w:t>}</w:t>
+          </w:tcPr>
+          <w:p>
+            <w:pPr>
+              <w:spacing w:after="0" w:line="240" w:lineRule="auto"/>
+              <w:rPr>
+                <w:sz w:val="20"/>
+                <w:szCs w:val="20"/>
+              </w:rPr>
+            </w:pPr>
+            <w:r>
+              <w:rPr>
+                <w:sz w:val="20"/>
+                <w:szCs w:val="20"/>
+              </w:rPr>
+              <w:t>${eventDuration}</w:t>
             </w:r>
           </w:p>
         </w:tc>
@@ -411,7 +339,6 @@
         <w:tc>
           <w:tcPr>
             <w:tcW w:w="4928" w:type="dxa"/>
-            <w:shd w:val="clear" w:color="auto" w:fill="auto"/>
           </w:tcPr>
           <w:p>
             <w:pPr>
@@ -434,15 +361,7 @@
                 <w:sz w:val="20"/>
                 <w:szCs w:val="20"/>
               </w:rPr>
-              <w:t xml:space="preserve"> ${</w:t>
-            </w:r>
-            <w:proofErr w:type="spellStart"/>
-            <w:r>
-              <w:rPr>
-                <w:sz w:val="20"/>
-                <w:szCs w:val="20"/>
-              </w:rPr>
-              <w:t>eventHasExecuted</w:t>
+              <w:t xml:space="preserve"> ${eventHasExecuted</w:t>
             </w:r>
             <w:r>
               <w:rPr>
@@ -451,7 +370,6 @@
               </w:rPr>
               <w:t>LikePredicted</w:t>
             </w:r>
-            <w:proofErr w:type="spellEnd"/>
             <w:r>
               <w:rPr>
                 <w:sz w:val="20"/>
@@ -464,7 +382,6 @@
         <w:tc>
           <w:tcPr>
             <w:tcW w:w="1701" w:type="dxa"/>
-            <w:shd w:val="clear" w:color="auto" w:fill="auto"/>
           </w:tcPr>
           <w:p>
             <w:pPr>
@@ -487,7 +404,6 @@
         <w:tc>
           <w:tcPr>
             <w:tcW w:w="3118" w:type="dxa"/>
-            <w:shd w:val="clear" w:color="auto" w:fill="auto"/>
           </w:tcPr>
           <w:p>
             <w:pPr>
@@ -502,30 +418,14 @@
                 <w:sz w:val="20"/>
                 <w:szCs w:val="20"/>
               </w:rPr>
-              <w:t>${</w:t>
-            </w:r>
-            <w:proofErr w:type="spellStart"/>
-            <w:r>
-              <w:rPr>
-                <w:sz w:val="20"/>
-                <w:szCs w:val="20"/>
-              </w:rPr>
-              <w:t>event</w:t>
-            </w:r>
-            <w:r>
-              <w:rPr>
-                <w:sz w:val="20"/>
-                <w:szCs w:val="20"/>
-              </w:rPr>
-              <w:t>Canceled</w:t>
-            </w:r>
-            <w:proofErr w:type="spellEnd"/>
-            <w:r>
-              <w:rPr>
-                <w:sz w:val="20"/>
-                <w:szCs w:val="20"/>
-              </w:rPr>
-              <w:t>}</w:t>
+              <w:t>${event</w:t>
+            </w:r>
+            <w:r>
+              <w:rPr>
+                <w:sz w:val="20"/>
+                <w:szCs w:val="20"/>
+              </w:rPr>
+              <w:t>Canceled}</w:t>
             </w:r>
           </w:p>
         </w:tc>
@@ -566,7 +466,6 @@
               <w:bottom w:val="nil"/>
               <w:right w:val="nil"/>
             </w:tcBorders>
-            <w:shd w:val="clear" w:color="auto" w:fill="auto"/>
           </w:tcPr>
           <w:p>
             <w:pPr>
@@ -611,23 +510,7 @@
                 <w:sz w:val="20"/>
                 <w:szCs w:val="20"/>
               </w:rPr>
-              <w:t>${</w:t>
-            </w:r>
-            <w:proofErr w:type="spellStart"/>
-            <w:r>
-              <w:rPr>
-                <w:sz w:val="20"/>
-                <w:szCs w:val="20"/>
-              </w:rPr>
-              <w:t>eventSubstitutionText</w:t>
-            </w:r>
-            <w:proofErr w:type="spellEnd"/>
-            <w:r>
-              <w:rPr>
-                <w:sz w:val="20"/>
-                <w:szCs w:val="20"/>
-              </w:rPr>
-              <w:t>}</w:t>
+              <w:t>${eventSubstitutionText}</w:t>
             </w:r>
           </w:p>
           <w:p>
@@ -690,7 +573,6 @@
         <w:tc>
           <w:tcPr>
             <w:tcW w:w="2410" w:type="dxa"/>
-            <w:shd w:val="clear" w:color="auto" w:fill="auto"/>
           </w:tcPr>
           <w:p>
             <w:pPr>
@@ -714,7 +596,6 @@
         <w:tc>
           <w:tcPr>
             <w:tcW w:w="2126" w:type="dxa"/>
-            <w:shd w:val="clear" w:color="auto" w:fill="auto"/>
           </w:tcPr>
           <w:p>
             <w:pPr>
@@ -736,38 +617,21 @@
         <w:tc>
           <w:tcPr>
             <w:tcW w:w="5211" w:type="dxa"/>
-            <w:shd w:val="clear" w:color="auto" w:fill="auto"/>
-          </w:tcPr>
-          <w:p>
-            <w:pPr>
-              <w:spacing w:after="0" w:line="240" w:lineRule="auto"/>
-              <w:rPr>
-                <w:sz w:val="20"/>
-                <w:szCs w:val="20"/>
-              </w:rPr>
-            </w:pPr>
-            <w:r>
-              <w:rPr>
-                <w:sz w:val="20"/>
-                <w:szCs w:val="20"/>
-              </w:rPr>
-              <w:t>${</w:t>
-            </w:r>
-            <w:proofErr w:type="spellStart"/>
-            <w:r>
-              <w:rPr>
-                <w:sz w:val="20"/>
-                <w:szCs w:val="20"/>
-              </w:rPr>
-              <w:t>eventInstructorName</w:t>
-            </w:r>
-            <w:proofErr w:type="spellEnd"/>
-            <w:r>
-              <w:rPr>
-                <w:sz w:val="20"/>
-                <w:szCs w:val="20"/>
-              </w:rPr>
-              <w:t>}</w:t>
+          </w:tcPr>
+          <w:p>
+            <w:pPr>
+              <w:spacing w:after="0" w:line="240" w:lineRule="auto"/>
+              <w:rPr>
+                <w:sz w:val="20"/>
+                <w:szCs w:val="20"/>
+              </w:rPr>
+            </w:pPr>
+            <w:r>
+              <w:rPr>
+                <w:sz w:val="20"/>
+                <w:szCs w:val="20"/>
+              </w:rPr>
+              <w:t>${eventInstructorName}</w:t>
             </w:r>
           </w:p>
         </w:tc>
@@ -776,7 +640,6 @@
         <w:tc>
           <w:tcPr>
             <w:tcW w:w="2410" w:type="dxa"/>
-            <w:shd w:val="clear" w:color="auto" w:fill="auto"/>
           </w:tcPr>
           <w:p>
             <w:pPr>
@@ -792,7 +655,6 @@
         <w:tc>
           <w:tcPr>
             <w:tcW w:w="2126" w:type="dxa"/>
-            <w:shd w:val="clear" w:color="auto" w:fill="auto"/>
           </w:tcPr>
           <w:p>
             <w:pPr>
@@ -814,38 +676,21 @@
         <w:tc>
           <w:tcPr>
             <w:tcW w:w="5211" w:type="dxa"/>
-            <w:shd w:val="clear" w:color="auto" w:fill="auto"/>
-          </w:tcPr>
-          <w:p>
-            <w:pPr>
-              <w:spacing w:after="0" w:line="240" w:lineRule="auto"/>
-              <w:rPr>
-                <w:sz w:val="20"/>
-                <w:szCs w:val="20"/>
-              </w:rPr>
-            </w:pPr>
-            <w:r>
-              <w:rPr>
-                <w:sz w:val="20"/>
-                <w:szCs w:val="20"/>
-              </w:rPr>
-              <w:t>${</w:t>
-            </w:r>
-            <w:proofErr w:type="spellStart"/>
-            <w:r>
-              <w:rPr>
-                <w:sz w:val="20"/>
-                <w:szCs w:val="20"/>
-              </w:rPr>
-              <w:t>eventInstructorStreet</w:t>
-            </w:r>
-            <w:proofErr w:type="spellEnd"/>
-            <w:r>
-              <w:rPr>
-                <w:sz w:val="20"/>
-                <w:szCs w:val="20"/>
-              </w:rPr>
-              <w:t>}</w:t>
+          </w:tcPr>
+          <w:p>
+            <w:pPr>
+              <w:spacing w:after="0" w:line="240" w:lineRule="auto"/>
+              <w:rPr>
+                <w:sz w:val="20"/>
+                <w:szCs w:val="20"/>
+              </w:rPr>
+            </w:pPr>
+            <w:r>
+              <w:rPr>
+                <w:sz w:val="20"/>
+                <w:szCs w:val="20"/>
+              </w:rPr>
+              <w:t>${eventInstructorStreet}</w:t>
             </w:r>
           </w:p>
         </w:tc>
@@ -854,7 +699,6 @@
         <w:tc>
           <w:tcPr>
             <w:tcW w:w="2410" w:type="dxa"/>
-            <w:shd w:val="clear" w:color="auto" w:fill="auto"/>
           </w:tcPr>
           <w:p>
             <w:pPr>
@@ -870,7 +714,6 @@
         <w:tc>
           <w:tcPr>
             <w:tcW w:w="2126" w:type="dxa"/>
-            <w:shd w:val="clear" w:color="auto" w:fill="auto"/>
           </w:tcPr>
           <w:p>
             <w:pPr>
@@ -892,38 +735,21 @@
         <w:tc>
           <w:tcPr>
             <w:tcW w:w="5211" w:type="dxa"/>
-            <w:shd w:val="clear" w:color="auto" w:fill="auto"/>
-          </w:tcPr>
-          <w:p>
-            <w:pPr>
-              <w:spacing w:after="0" w:line="240" w:lineRule="auto"/>
-              <w:rPr>
-                <w:sz w:val="20"/>
-                <w:szCs w:val="20"/>
-              </w:rPr>
-            </w:pPr>
-            <w:r>
-              <w:rPr>
-                <w:sz w:val="20"/>
-                <w:szCs w:val="20"/>
-              </w:rPr>
-              <w:t>${</w:t>
-            </w:r>
-            <w:proofErr w:type="spellStart"/>
-            <w:r>
-              <w:rPr>
-                <w:sz w:val="20"/>
-                <w:szCs w:val="20"/>
-              </w:rPr>
-              <w:t>eventInstructorPostalCity</w:t>
-            </w:r>
-            <w:proofErr w:type="spellEnd"/>
-            <w:r>
-              <w:rPr>
-                <w:sz w:val="20"/>
-                <w:szCs w:val="20"/>
-              </w:rPr>
-              <w:t>}</w:t>
+          </w:tcPr>
+          <w:p>
+            <w:pPr>
+              <w:spacing w:after="0" w:line="240" w:lineRule="auto"/>
+              <w:rPr>
+                <w:sz w:val="20"/>
+                <w:szCs w:val="20"/>
+              </w:rPr>
+            </w:pPr>
+            <w:r>
+              <w:rPr>
+                <w:sz w:val="20"/>
+                <w:szCs w:val="20"/>
+              </w:rPr>
+              <w:t>${eventInstructorPostalCity}</w:t>
             </w:r>
           </w:p>
         </w:tc>
@@ -935,7 +761,6 @@
         <w:tc>
           <w:tcPr>
             <w:tcW w:w="2410" w:type="dxa"/>
-            <w:shd w:val="clear" w:color="auto" w:fill="auto"/>
           </w:tcPr>
           <w:p>
             <w:pPr>
@@ -951,7 +776,6 @@
         <w:tc>
           <w:tcPr>
             <w:tcW w:w="2126" w:type="dxa"/>
-            <w:shd w:val="clear" w:color="auto" w:fill="auto"/>
           </w:tcPr>
           <w:p>
             <w:pPr>
@@ -973,38 +797,21 @@
         <w:tc>
           <w:tcPr>
             <w:tcW w:w="5211" w:type="dxa"/>
-            <w:shd w:val="clear" w:color="auto" w:fill="auto"/>
-          </w:tcPr>
-          <w:p>
-            <w:pPr>
-              <w:spacing w:after="0" w:line="240" w:lineRule="auto"/>
-              <w:rPr>
-                <w:sz w:val="20"/>
-                <w:szCs w:val="20"/>
-              </w:rPr>
-            </w:pPr>
-            <w:r>
-              <w:rPr>
-                <w:sz w:val="20"/>
-                <w:szCs w:val="20"/>
-              </w:rPr>
-              <w:t>${</w:t>
-            </w:r>
-            <w:proofErr w:type="spellStart"/>
-            <w:r>
-              <w:rPr>
-                <w:sz w:val="20"/>
-                <w:szCs w:val="20"/>
-              </w:rPr>
-              <w:t>eventInstructorPhone</w:t>
-            </w:r>
-            <w:proofErr w:type="spellEnd"/>
-            <w:r>
-              <w:rPr>
-                <w:sz w:val="20"/>
-                <w:szCs w:val="20"/>
-              </w:rPr>
-              <w:t>}</w:t>
+          </w:tcPr>
+          <w:p>
+            <w:pPr>
+              <w:spacing w:after="0" w:line="240" w:lineRule="auto"/>
+              <w:rPr>
+                <w:sz w:val="20"/>
+                <w:szCs w:val="20"/>
+              </w:rPr>
+            </w:pPr>
+            <w:r>
+              <w:rPr>
+                <w:sz w:val="20"/>
+                <w:szCs w:val="20"/>
+              </w:rPr>
+              <w:t>${eventInstructorPhone}</w:t>
             </w:r>
           </w:p>
         </w:tc>
@@ -1013,7 +820,6 @@
         <w:tc>
           <w:tcPr>
             <w:tcW w:w="2410" w:type="dxa"/>
-            <w:shd w:val="clear" w:color="auto" w:fill="auto"/>
           </w:tcPr>
           <w:p>
             <w:pPr>
@@ -1046,92 +852,42 @@
         <w:tc>
           <w:tcPr>
             <w:tcW w:w="2126" w:type="dxa"/>
-            <w:shd w:val="clear" w:color="auto" w:fill="auto"/>
-          </w:tcPr>
-          <w:p>
-            <w:pPr>
-              <w:spacing w:after="0" w:line="240" w:lineRule="auto"/>
-              <w:rPr>
-                <w:sz w:val="20"/>
-                <w:szCs w:val="20"/>
-              </w:rPr>
-            </w:pPr>
-            <w:r>
-              <w:rPr>
-                <w:sz w:val="20"/>
-                <w:szCs w:val="20"/>
-              </w:rPr>
-              <w:t>${</w:t>
-            </w:r>
-            <w:proofErr w:type="spellStart"/>
-            <w:r>
-              <w:rPr>
-                <w:sz w:val="20"/>
-                <w:szCs w:val="20"/>
-              </w:rPr>
-              <w:t>countParticipants</w:t>
-            </w:r>
-            <w:proofErr w:type="spellEnd"/>
-            <w:r>
-              <w:rPr>
-                <w:sz w:val="20"/>
-                <w:szCs w:val="20"/>
-              </w:rPr>
-              <w:t>}</w:t>
+          </w:tcPr>
+          <w:p>
+            <w:pPr>
+              <w:spacing w:after="0" w:line="240" w:lineRule="auto"/>
+              <w:rPr>
+                <w:sz w:val="20"/>
+                <w:szCs w:val="20"/>
+              </w:rPr>
+            </w:pPr>
+            <w:r>
+              <w:rPr>
+                <w:sz w:val="20"/>
+                <w:szCs w:val="20"/>
+              </w:rPr>
+              <w:t>${countParticipants}</w:t>
             </w:r>
           </w:p>
         </w:tc>
         <w:tc>
           <w:tcPr>
             <w:tcW w:w="5211" w:type="dxa"/>
-            <w:shd w:val="clear" w:color="auto" w:fill="auto"/>
-          </w:tcPr>
-          <w:p>
-            <w:pPr>
-              <w:spacing w:after="0" w:line="240" w:lineRule="auto"/>
-              <w:rPr>
-                <w:sz w:val="20"/>
-                <w:szCs w:val="20"/>
-              </w:rPr>
-            </w:pPr>
-            <w:r>
-              <w:rPr>
-                <w:sz w:val="20"/>
-                <w:szCs w:val="20"/>
-              </w:rPr>
-              <w:t>${</w:t>
-            </w:r>
-            <w:proofErr w:type="spellStart"/>
-            <w:r>
-              <w:rPr>
-                <w:sz w:val="20"/>
-                <w:szCs w:val="20"/>
-              </w:rPr>
-              <w:t>countFemale</w:t>
-            </w:r>
-            <w:proofErr w:type="spellEnd"/>
-            <w:r>
-              <w:rPr>
-                <w:sz w:val="20"/>
-                <w:szCs w:val="20"/>
-              </w:rPr>
-              <w:t>} W und ${</w:t>
-            </w:r>
-            <w:proofErr w:type="spellStart"/>
-            <w:r>
-              <w:rPr>
-                <w:sz w:val="20"/>
-                <w:szCs w:val="20"/>
-              </w:rPr>
-              <w:t>countMale</w:t>
-            </w:r>
-            <w:proofErr w:type="spellEnd"/>
-            <w:r>
-              <w:rPr>
-                <w:sz w:val="20"/>
-                <w:szCs w:val="20"/>
-              </w:rPr>
-              <w:t>} M</w:t>
+          </w:tcPr>
+          <w:p>
+            <w:pPr>
+              <w:spacing w:after="0" w:line="240" w:lineRule="auto"/>
+              <w:rPr>
+                <w:sz w:val="20"/>
+                <w:szCs w:val="20"/>
+              </w:rPr>
+            </w:pPr>
+            <w:r>
+              <w:rPr>
+                <w:sz w:val="20"/>
+                <w:szCs w:val="20"/>
+              </w:rPr>
+              <w:t>${countFemale} W und ${countMale} M</w:t>
             </w:r>
           </w:p>
         </w:tc>
@@ -1177,8 +933,7 @@
         </w:trPr>
         <w:tc>
           <w:tcPr>
-            <w:tcW w:w="3709" w:type="dxa"/>
-            <w:shd w:val="clear" w:color="auto" w:fill="auto"/>
+            <w:tcW w:w="3367" w:type="dxa"/>
           </w:tcPr>
           <w:p>
             <w:pPr>
@@ -1201,8 +956,7 @@
         </w:tc>
         <w:tc>
           <w:tcPr>
-            <w:tcW w:w="1604" w:type="dxa"/>
-            <w:shd w:val="clear" w:color="auto" w:fill="auto"/>
+            <w:tcW w:w="2420" w:type="dxa"/>
           </w:tcPr>
           <w:p>
             <w:pPr>
@@ -1225,8 +979,7 @@
         </w:tc>
         <w:tc>
           <w:tcPr>
-            <w:tcW w:w="4434" w:type="dxa"/>
-            <w:shd w:val="clear" w:color="auto" w:fill="auto"/>
+            <w:tcW w:w="3853" w:type="dxa"/>
           </w:tcPr>
           <w:p>
             <w:pPr>
@@ -1254,11 +1007,10 @@
         </w:trPr>
         <w:tc>
           <w:tcPr>
-            <w:tcW w:w="3709" w:type="dxa"/>
+            <w:tcW w:w="3367" w:type="dxa"/>
             <w:tcBorders>
               <w:bottom w:val="single" w:sz="4" w:space="0" w:color="auto"/>
             </w:tcBorders>
-            <w:shd w:val="clear" w:color="auto" w:fill="auto"/>
           </w:tcPr>
           <w:p>
             <w:pPr>
@@ -1281,11 +1033,10 @@
         </w:tc>
         <w:tc>
           <w:tcPr>
-            <w:tcW w:w="1604" w:type="dxa"/>
+            <w:tcW w:w="2420" w:type="dxa"/>
             <w:tcBorders>
               <w:bottom w:val="single" w:sz="4" w:space="0" w:color="auto"/>
             </w:tcBorders>
-            <w:shd w:val="clear" w:color="auto" w:fill="auto"/>
           </w:tcPr>
           <w:p>
             <w:pPr>
@@ -1301,64 +1052,31 @@
                 <w:sz w:val="20"/>
                 <w:szCs w:val="20"/>
               </w:rPr>
-              <w:t>${</w:t>
-            </w:r>
-            <w:proofErr w:type="spellStart"/>
-            <w:r>
-              <w:rPr>
-                <w:sz w:val="20"/>
-                <w:szCs w:val="20"/>
-              </w:rPr>
-              <w:t>sleepingTaxes</w:t>
-            </w:r>
-            <w:proofErr w:type="spellEnd"/>
-            <w:r>
-              <w:rPr>
-                <w:sz w:val="20"/>
-                <w:szCs w:val="20"/>
-              </w:rPr>
-              <w:t>} CHF</w:t>
-            </w:r>
-          </w:p>
-        </w:tc>
-        <w:tc>
-          <w:tcPr>
-            <w:tcW w:w="4434" w:type="dxa"/>
+              <w:t>${sleepingTaxes} CHF</w:t>
+            </w:r>
+          </w:p>
+        </w:tc>
+        <w:tc>
+          <w:tcPr>
+            <w:tcW w:w="3853" w:type="dxa"/>
             <w:tcBorders>
               <w:bottom w:val="single" w:sz="4" w:space="0" w:color="auto"/>
             </w:tcBorders>
-            <w:shd w:val="clear" w:color="auto" w:fill="auto"/>
-          </w:tcPr>
-          <w:p>
-            <w:pPr>
-              <w:spacing w:after="0" w:line="240" w:lineRule="auto"/>
-              <w:rPr>
-                <w:sz w:val="20"/>
-                <w:szCs w:val="20"/>
-              </w:rPr>
-            </w:pPr>
-            <w:r>
-              <w:rPr>
-                <w:sz w:val="20"/>
-                <w:szCs w:val="20"/>
-              </w:rPr>
-              <w:t>${</w:t>
-            </w:r>
-            <w:proofErr w:type="spellStart"/>
-            <w:r>
-              <w:rPr>
-                <w:sz w:val="20"/>
-                <w:szCs w:val="20"/>
-              </w:rPr>
-              <w:t>sleepingTaxesText</w:t>
-            </w:r>
-            <w:proofErr w:type="spellEnd"/>
-            <w:r>
-              <w:rPr>
-                <w:sz w:val="20"/>
-                <w:szCs w:val="20"/>
-              </w:rPr>
-              <w:t>}</w:t>
+          </w:tcPr>
+          <w:p>
+            <w:pPr>
+              <w:spacing w:after="0" w:line="240" w:lineRule="auto"/>
+              <w:rPr>
+                <w:sz w:val="20"/>
+                <w:szCs w:val="20"/>
+              </w:rPr>
+            </w:pPr>
+            <w:r>
+              <w:rPr>
+                <w:sz w:val="20"/>
+                <w:szCs w:val="20"/>
+              </w:rPr>
+              <w:t>${sleepingTaxesText}</w:t>
             </w:r>
           </w:p>
         </w:tc>
@@ -1369,12 +1087,11 @@
         </w:trPr>
         <w:tc>
           <w:tcPr>
-            <w:tcW w:w="3709" w:type="dxa"/>
+            <w:tcW w:w="3367" w:type="dxa"/>
             <w:tcBorders>
               <w:top w:val="single" w:sz="4" w:space="0" w:color="auto"/>
               <w:bottom w:val="single" w:sz="4" w:space="0" w:color="auto"/>
             </w:tcBorders>
-            <w:shd w:val="clear" w:color="auto" w:fill="auto"/>
           </w:tcPr>
           <w:p>
             <w:pPr>
@@ -1397,12 +1114,11 @@
         </w:tc>
         <w:tc>
           <w:tcPr>
-            <w:tcW w:w="1604" w:type="dxa"/>
+            <w:tcW w:w="2420" w:type="dxa"/>
             <w:tcBorders>
               <w:top w:val="single" w:sz="4" w:space="0" w:color="auto"/>
               <w:bottom w:val="single" w:sz="4" w:space="0" w:color="auto"/>
             </w:tcBorders>
-            <w:shd w:val="clear" w:color="auto" w:fill="auto"/>
           </w:tcPr>
           <w:p>
             <w:pPr>
@@ -1418,65 +1134,32 @@
                 <w:sz w:val="20"/>
                 <w:szCs w:val="20"/>
               </w:rPr>
-              <w:t>${</w:t>
-            </w:r>
-            <w:proofErr w:type="spellStart"/>
-            <w:r>
-              <w:rPr>
-                <w:sz w:val="20"/>
-                <w:szCs w:val="20"/>
-              </w:rPr>
-              <w:t>miscTaxes</w:t>
-            </w:r>
-            <w:proofErr w:type="spellEnd"/>
-            <w:r>
-              <w:rPr>
-                <w:sz w:val="20"/>
-                <w:szCs w:val="20"/>
-              </w:rPr>
-              <w:t>} CHF</w:t>
-            </w:r>
-          </w:p>
-        </w:tc>
-        <w:tc>
-          <w:tcPr>
-            <w:tcW w:w="4434" w:type="dxa"/>
+              <w:t>${miscTaxes} CHF</w:t>
+            </w:r>
+          </w:p>
+        </w:tc>
+        <w:tc>
+          <w:tcPr>
+            <w:tcW w:w="3853" w:type="dxa"/>
             <w:tcBorders>
               <w:top w:val="single" w:sz="4" w:space="0" w:color="auto"/>
               <w:bottom w:val="single" w:sz="4" w:space="0" w:color="auto"/>
             </w:tcBorders>
-            <w:shd w:val="clear" w:color="auto" w:fill="auto"/>
-          </w:tcPr>
-          <w:p>
-            <w:pPr>
-              <w:spacing w:after="0" w:line="240" w:lineRule="auto"/>
-              <w:rPr>
-                <w:sz w:val="20"/>
-                <w:szCs w:val="20"/>
-              </w:rPr>
-            </w:pPr>
-            <w:r>
-              <w:rPr>
-                <w:sz w:val="20"/>
-                <w:szCs w:val="20"/>
-              </w:rPr>
-              <w:t>${</w:t>
-            </w:r>
-            <w:proofErr w:type="spellStart"/>
-            <w:r>
-              <w:rPr>
-                <w:sz w:val="20"/>
-                <w:szCs w:val="20"/>
-              </w:rPr>
-              <w:t>miscTaxesText</w:t>
-            </w:r>
-            <w:proofErr w:type="spellEnd"/>
-            <w:r>
-              <w:rPr>
-                <w:sz w:val="20"/>
-                <w:szCs w:val="20"/>
-              </w:rPr>
-              <w:t>}</w:t>
+          </w:tcPr>
+          <w:p>
+            <w:pPr>
+              <w:spacing w:after="0" w:line="240" w:lineRule="auto"/>
+              <w:rPr>
+                <w:sz w:val="20"/>
+                <w:szCs w:val="20"/>
+              </w:rPr>
+            </w:pPr>
+            <w:r>
+              <w:rPr>
+                <w:sz w:val="20"/>
+                <w:szCs w:val="20"/>
+              </w:rPr>
+              <w:t>${miscTaxesText}</w:t>
             </w:r>
           </w:p>
         </w:tc>
@@ -1487,12 +1170,11 @@
         </w:trPr>
         <w:tc>
           <w:tcPr>
-            <w:tcW w:w="3709" w:type="dxa"/>
+            <w:tcW w:w="3367" w:type="dxa"/>
             <w:tcBorders>
               <w:top w:val="single" w:sz="4" w:space="0" w:color="auto"/>
               <w:bottom w:val="single" w:sz="4" w:space="0" w:color="auto"/>
             </w:tcBorders>
-            <w:shd w:val="clear" w:color="auto" w:fill="auto"/>
           </w:tcPr>
           <w:p>
             <w:pPr>
@@ -1515,12 +1197,11 @@
         </w:tc>
         <w:tc>
           <w:tcPr>
-            <w:tcW w:w="1604" w:type="dxa"/>
+            <w:tcW w:w="2420" w:type="dxa"/>
             <w:tcBorders>
               <w:top w:val="single" w:sz="4" w:space="0" w:color="auto"/>
               <w:bottom w:val="single" w:sz="4" w:space="0" w:color="auto"/>
             </w:tcBorders>
-            <w:shd w:val="clear" w:color="auto" w:fill="auto"/>
           </w:tcPr>
           <w:p>
             <w:pPr>
@@ -1535,12 +1216,11 @@
         </w:tc>
         <w:tc>
           <w:tcPr>
-            <w:tcW w:w="4434" w:type="dxa"/>
+            <w:tcW w:w="3853" w:type="dxa"/>
             <w:tcBorders>
               <w:top w:val="single" w:sz="4" w:space="0" w:color="auto"/>
               <w:bottom w:val="single" w:sz="4" w:space="0" w:color="auto"/>
             </w:tcBorders>
-            <w:shd w:val="clear" w:color="auto" w:fill="auto"/>
           </w:tcPr>
           <w:p>
             <w:pPr>
@@ -1559,11 +1239,10 @@
         </w:trPr>
         <w:tc>
           <w:tcPr>
-            <w:tcW w:w="3709" w:type="dxa"/>
+            <w:tcW w:w="3367" w:type="dxa"/>
             <w:tcBorders>
               <w:top w:val="single" w:sz="4" w:space="0" w:color="auto"/>
             </w:tcBorders>
-            <w:shd w:val="clear" w:color="auto" w:fill="auto"/>
           </w:tcPr>
           <w:p>
             <w:pPr>
@@ -1578,21 +1257,12 @@
                 <w:szCs w:val="20"/>
               </w:rPr>
             </w:pPr>
-            <w:proofErr w:type="spellStart"/>
-            <w:r>
-              <w:rPr>
-                <w:sz w:val="20"/>
-                <w:szCs w:val="20"/>
-              </w:rPr>
-              <w:t>Öv</w:t>
-            </w:r>
-            <w:proofErr w:type="spellEnd"/>
-            <w:r>
-              <w:rPr>
-                <w:sz w:val="20"/>
-                <w:szCs w:val="20"/>
-              </w:rPr>
-              <w:t>: Ha</w:t>
+            <w:r>
+              <w:rPr>
+                <w:sz w:val="20"/>
+                <w:szCs w:val="20"/>
+              </w:rPr>
+              <w:t>Öv: Ha</w:t>
             </w:r>
             <w:r>
               <w:rPr>
@@ -1605,11 +1275,10 @@
         </w:tc>
         <w:tc>
           <w:tcPr>
-            <w:tcW w:w="1604" w:type="dxa"/>
+            <w:tcW w:w="2420" w:type="dxa"/>
             <w:tcBorders>
               <w:top w:val="single" w:sz="4" w:space="0" w:color="auto"/>
             </w:tcBorders>
-            <w:shd w:val="clear" w:color="auto" w:fill="auto"/>
           </w:tcPr>
           <w:p>
             <w:pPr>
@@ -1625,23 +1294,7 @@
                 <w:sz w:val="20"/>
                 <w:szCs w:val="20"/>
               </w:rPr>
-              <w:t>${</w:t>
-            </w:r>
-            <w:proofErr w:type="spellStart"/>
-            <w:r>
-              <w:rPr>
-                <w:sz w:val="20"/>
-                <w:szCs w:val="20"/>
-              </w:rPr>
-              <w:t>railwTaxes</w:t>
-            </w:r>
-            <w:proofErr w:type="spellEnd"/>
-            <w:r>
-              <w:rPr>
-                <w:sz w:val="20"/>
-                <w:szCs w:val="20"/>
-              </w:rPr>
-              <w:t>}</w:t>
+              <w:t>${railwTaxes}</w:t>
             </w:r>
             <w:r>
               <w:rPr>
@@ -1654,42 +1307,25 @@
         </w:tc>
         <w:tc>
           <w:tcPr>
-            <w:tcW w:w="4434" w:type="dxa"/>
+            <w:tcW w:w="3853" w:type="dxa"/>
             <w:tcBorders>
               <w:top w:val="single" w:sz="4" w:space="0" w:color="auto"/>
             </w:tcBorders>
-            <w:shd w:val="clear" w:color="auto" w:fill="auto"/>
-          </w:tcPr>
-          <w:p>
-            <w:pPr>
-              <w:spacing w:after="0" w:line="240" w:lineRule="auto"/>
-              <w:rPr>
-                <w:sz w:val="20"/>
-                <w:szCs w:val="20"/>
-              </w:rPr>
-            </w:pPr>
-            <w:r>
-              <w:rPr>
-                <w:sz w:val="20"/>
-                <w:szCs w:val="20"/>
-              </w:rPr>
-              <w:t>${</w:t>
-            </w:r>
-            <w:proofErr w:type="spellStart"/>
-            <w:r>
-              <w:rPr>
-                <w:sz w:val="20"/>
-                <w:szCs w:val="20"/>
-              </w:rPr>
-              <w:t>railwTaxesText</w:t>
-            </w:r>
-            <w:proofErr w:type="spellEnd"/>
-            <w:r>
-              <w:rPr>
-                <w:sz w:val="20"/>
-                <w:szCs w:val="20"/>
-              </w:rPr>
-              <w:t>}</w:t>
+          </w:tcPr>
+          <w:p>
+            <w:pPr>
+              <w:spacing w:after="0" w:line="240" w:lineRule="auto"/>
+              <w:rPr>
+                <w:sz w:val="20"/>
+                <w:szCs w:val="20"/>
+              </w:rPr>
+            </w:pPr>
+            <w:r>
+              <w:rPr>
+                <w:sz w:val="20"/>
+                <w:szCs w:val="20"/>
+              </w:rPr>
+              <w:t>${railwTaxesText}</w:t>
             </w:r>
           </w:p>
         </w:tc>
@@ -1700,8 +1336,7 @@
         </w:trPr>
         <w:tc>
           <w:tcPr>
-            <w:tcW w:w="3709" w:type="dxa"/>
-            <w:shd w:val="clear" w:color="auto" w:fill="auto"/>
+            <w:tcW w:w="3367" w:type="dxa"/>
           </w:tcPr>
           <w:p>
             <w:pPr>
@@ -1727,8 +1362,7 @@
         </w:tc>
         <w:tc>
           <w:tcPr>
-            <w:tcW w:w="1604" w:type="dxa"/>
-            <w:shd w:val="clear" w:color="auto" w:fill="auto"/>
+            <w:tcW w:w="2420" w:type="dxa"/>
           </w:tcPr>
           <w:p>
             <w:pPr>
@@ -1744,15 +1378,7 @@
                 <w:sz w:val="20"/>
                 <w:szCs w:val="20"/>
               </w:rPr>
-              <w:t>${</w:t>
-            </w:r>
-            <w:proofErr w:type="spellStart"/>
-            <w:r>
-              <w:rPr>
-                <w:sz w:val="20"/>
-                <w:szCs w:val="20"/>
-              </w:rPr>
-              <w:t>c</w:t>
+              <w:t>${c</w:t>
             </w:r>
             <w:r>
               <w:rPr>
@@ -1766,15 +1392,7 @@
                 <w:sz w:val="20"/>
                 <w:szCs w:val="20"/>
               </w:rPr>
-              <w:t>CarTaxes</w:t>
-            </w:r>
-            <w:proofErr w:type="spellEnd"/>
-            <w:r>
-              <w:rPr>
-                <w:sz w:val="20"/>
-                <w:szCs w:val="20"/>
-              </w:rPr>
-              <w:t>}</w:t>
+              <w:t>CarTaxes}</w:t>
             </w:r>
             <w:r>
               <w:rPr>
@@ -1787,31 +1405,22 @@
         </w:tc>
         <w:tc>
           <w:tcPr>
-            <w:tcW w:w="4434" w:type="dxa"/>
-            <w:shd w:val="clear" w:color="auto" w:fill="auto"/>
-          </w:tcPr>
-          <w:p>
-            <w:pPr>
-              <w:spacing w:after="0" w:line="240" w:lineRule="auto"/>
-              <w:rPr>
-                <w:sz w:val="20"/>
-                <w:szCs w:val="20"/>
-              </w:rPr>
-            </w:pPr>
-            <w:r>
-              <w:rPr>
-                <w:sz w:val="20"/>
-                <w:szCs w:val="20"/>
-              </w:rPr>
-              <w:t>${</w:t>
-            </w:r>
-            <w:proofErr w:type="spellStart"/>
-            <w:r>
-              <w:rPr>
-                <w:sz w:val="20"/>
-                <w:szCs w:val="20"/>
-              </w:rPr>
-              <w:t>ca</w:t>
+            <w:tcW w:w="3853" w:type="dxa"/>
+          </w:tcPr>
+          <w:p>
+            <w:pPr>
+              <w:spacing w:after="0" w:line="240" w:lineRule="auto"/>
+              <w:rPr>
+                <w:sz w:val="20"/>
+                <w:szCs w:val="20"/>
+              </w:rPr>
+            </w:pPr>
+            <w:r>
+              <w:rPr>
+                <w:sz w:val="20"/>
+                <w:szCs w:val="20"/>
+              </w:rPr>
+              <w:t>${ca</w:t>
             </w:r>
             <w:r>
               <w:rPr>
@@ -1825,15 +1434,7 @@
                 <w:sz w:val="20"/>
                 <w:szCs w:val="20"/>
               </w:rPr>
-              <w:t>CarTaxesText</w:t>
-            </w:r>
-            <w:proofErr w:type="spellEnd"/>
-            <w:r>
-              <w:rPr>
-                <w:sz w:val="20"/>
-                <w:szCs w:val="20"/>
-              </w:rPr>
-              <w:t>}</w:t>
+              <w:t>CarTaxesText}</w:t>
             </w:r>
           </w:p>
         </w:tc>
@@ -1844,11 +1445,10 @@
         </w:trPr>
         <w:tc>
           <w:tcPr>
-            <w:tcW w:w="3709" w:type="dxa"/>
+            <w:tcW w:w="3367" w:type="dxa"/>
             <w:tcBorders>
               <w:bottom w:val="single" w:sz="4" w:space="0" w:color="auto"/>
             </w:tcBorders>
-            <w:shd w:val="clear" w:color="auto" w:fill="auto"/>
           </w:tcPr>
           <w:p>
             <w:pPr>
@@ -1881,11 +1481,10 @@
         </w:tc>
         <w:tc>
           <w:tcPr>
-            <w:tcW w:w="1604" w:type="dxa"/>
+            <w:tcW w:w="2420" w:type="dxa"/>
             <w:tcBorders>
               <w:bottom w:val="single" w:sz="4" w:space="0" w:color="auto"/>
             </w:tcBorders>
-            <w:shd w:val="clear" w:color="auto" w:fill="auto"/>
           </w:tcPr>
           <w:p>
             <w:pPr>
@@ -1901,23 +1500,7 @@
                 <w:sz w:val="20"/>
                 <w:szCs w:val="20"/>
               </w:rPr>
-              <w:t>${</w:t>
-            </w:r>
-            <w:proofErr w:type="spellStart"/>
-            <w:r>
-              <w:rPr>
-                <w:sz w:val="20"/>
-                <w:szCs w:val="20"/>
-              </w:rPr>
-              <w:t>carTaxes</w:t>
-            </w:r>
-            <w:proofErr w:type="spellEnd"/>
-            <w:r>
-              <w:rPr>
-                <w:sz w:val="20"/>
-                <w:szCs w:val="20"/>
-              </w:rPr>
-              <w:t>}</w:t>
+              <w:t>${carTaxes}</w:t>
             </w:r>
             <w:r>
               <w:rPr>
@@ -1930,11 +1513,10 @@
         </w:tc>
         <w:tc>
           <w:tcPr>
-            <w:tcW w:w="4434" w:type="dxa"/>
+            <w:tcW w:w="3853" w:type="dxa"/>
             <w:tcBorders>
               <w:bottom w:val="single" w:sz="4" w:space="0" w:color="auto"/>
             </w:tcBorders>
-            <w:shd w:val="clear" w:color="auto" w:fill="auto"/>
           </w:tcPr>
           <w:p>
             <w:pPr>
@@ -1956,23 +1538,7 @@
                 <w:sz w:val="20"/>
                 <w:szCs w:val="20"/>
               </w:rPr>
-              <w:t>${</w:t>
-            </w:r>
-            <w:proofErr w:type="spellStart"/>
-            <w:r>
-              <w:rPr>
-                <w:sz w:val="20"/>
-                <w:szCs w:val="20"/>
-              </w:rPr>
-              <w:t>carTaxesKm</w:t>
-            </w:r>
-            <w:proofErr w:type="spellEnd"/>
-            <w:r>
-              <w:rPr>
-                <w:sz w:val="20"/>
-                <w:szCs w:val="20"/>
-              </w:rPr>
-              <w:t>} km</w:t>
+              <w:t>${carTaxesKm} km</w:t>
             </w:r>
           </w:p>
           <w:p>
@@ -2037,23 +1603,7 @@
                 <w:sz w:val="20"/>
                 <w:szCs w:val="20"/>
               </w:rPr>
-              <w:t>${</w:t>
-            </w:r>
-            <w:proofErr w:type="spellStart"/>
-            <w:r>
-              <w:rPr>
-                <w:sz w:val="20"/>
-                <w:szCs w:val="20"/>
-              </w:rPr>
-              <w:t>roadTaxes</w:t>
-            </w:r>
-            <w:proofErr w:type="spellEnd"/>
-            <w:r>
-              <w:rPr>
-                <w:sz w:val="20"/>
-                <w:szCs w:val="20"/>
-              </w:rPr>
-              <w:t>}</w:t>
+              <w:t>${roadTaxes}</w:t>
             </w:r>
             <w:r>
               <w:rPr>
@@ -2090,23 +1640,7 @@
                 <w:sz w:val="20"/>
                 <w:szCs w:val="20"/>
               </w:rPr>
-              <w:t>${</w:t>
-            </w:r>
-            <w:proofErr w:type="spellStart"/>
-            <w:r>
-              <w:rPr>
-                <w:sz w:val="20"/>
-                <w:szCs w:val="20"/>
-              </w:rPr>
-              <w:t>countCars</w:t>
-            </w:r>
-            <w:proofErr w:type="spellEnd"/>
-            <w:r>
-              <w:rPr>
-                <w:sz w:val="20"/>
-                <w:szCs w:val="20"/>
-              </w:rPr>
-              <w:t>}</w:t>
+              <w:t>${countCars}</w:t>
             </w:r>
           </w:p>
           <w:p>
@@ -2136,23 +1670,7 @@
                 <w:sz w:val="20"/>
                 <w:szCs w:val="20"/>
               </w:rPr>
-              <w:t>: ${</w:t>
-            </w:r>
-            <w:proofErr w:type="spellStart"/>
-            <w:r>
-              <w:rPr>
-                <w:sz w:val="20"/>
-                <w:szCs w:val="20"/>
-              </w:rPr>
-              <w:t>privateArrival</w:t>
-            </w:r>
-            <w:proofErr w:type="spellEnd"/>
-            <w:r>
-              <w:rPr>
-                <w:sz w:val="20"/>
-                <w:szCs w:val="20"/>
-              </w:rPr>
-              <w:t>}</w:t>
+              <w:t>: ${privateArrival}</w:t>
             </w:r>
           </w:p>
         </w:tc>
@@ -2163,12 +1681,11 @@
         </w:trPr>
         <w:tc>
           <w:tcPr>
-            <w:tcW w:w="3709" w:type="dxa"/>
+            <w:tcW w:w="3367" w:type="dxa"/>
             <w:tcBorders>
               <w:top w:val="single" w:sz="4" w:space="0" w:color="auto"/>
               <w:bottom w:val="single" w:sz="4" w:space="0" w:color="auto"/>
             </w:tcBorders>
-            <w:shd w:val="clear" w:color="auto" w:fill="auto"/>
           </w:tcPr>
           <w:p>
             <w:pPr>
@@ -2220,12 +1737,11 @@
         </w:tc>
         <w:tc>
           <w:tcPr>
-            <w:tcW w:w="1604" w:type="dxa"/>
+            <w:tcW w:w="2420" w:type="dxa"/>
             <w:tcBorders>
               <w:top w:val="single" w:sz="4" w:space="0" w:color="auto"/>
               <w:bottom w:val="single" w:sz="4" w:space="0" w:color="auto"/>
             </w:tcBorders>
-            <w:shd w:val="clear" w:color="auto" w:fill="auto"/>
           </w:tcPr>
           <w:p>
             <w:pPr>
@@ -2243,7 +1759,6 @@
               </w:rPr>
               <w:t>${</w:t>
             </w:r>
-            <w:proofErr w:type="spellStart"/>
             <w:r>
               <w:rPr>
                 <w:sz w:val="20"/>
@@ -2251,7 +1766,6 @@
               </w:rPr>
               <w:t>expenseReimbursement</w:t>
             </w:r>
-            <w:proofErr w:type="spellEnd"/>
             <w:r>
               <w:rPr>
                 <w:sz w:val="20"/>
@@ -2270,12 +1784,11 @@
         </w:tc>
         <w:tc>
           <w:tcPr>
-            <w:tcW w:w="4434" w:type="dxa"/>
+            <w:tcW w:w="3853" w:type="dxa"/>
             <w:tcBorders>
               <w:top w:val="single" w:sz="4" w:space="0" w:color="auto"/>
               <w:bottom w:val="single" w:sz="4" w:space="0" w:color="auto"/>
             </w:tcBorders>
-            <w:shd w:val="clear" w:color="auto" w:fill="auto"/>
           </w:tcPr>
           <w:p>
             <w:pPr>
@@ -2294,12 +1807,11 @@
         </w:trPr>
         <w:tc>
           <w:tcPr>
-            <w:tcW w:w="3709" w:type="dxa"/>
+            <w:tcW w:w="3367" w:type="dxa"/>
             <w:tcBorders>
               <w:top w:val="single" w:sz="4" w:space="0" w:color="auto"/>
               <w:bottom w:val="single" w:sz="4" w:space="0" w:color="auto"/>
             </w:tcBorders>
-            <w:shd w:val="clear" w:color="auto" w:fill="auto"/>
           </w:tcPr>
           <w:p>
             <w:pPr>
@@ -2363,12 +1875,11 @@
         </w:tc>
         <w:tc>
           <w:tcPr>
-            <w:tcW w:w="1604" w:type="dxa"/>
+            <w:tcW w:w="2420" w:type="dxa"/>
             <w:tcBorders>
               <w:top w:val="single" w:sz="4" w:space="0" w:color="auto"/>
               <w:bottom w:val="single" w:sz="4" w:space="0" w:color="auto"/>
             </w:tcBorders>
-            <w:shd w:val="clear" w:color="auto" w:fill="auto"/>
           </w:tcPr>
           <w:p>
             <w:pPr>
@@ -2386,7 +1897,6 @@
               </w:rPr>
               <w:t>${</w:t>
             </w:r>
-            <w:proofErr w:type="spellStart"/>
             <w:r>
               <w:rPr>
                 <w:sz w:val="20"/>
@@ -2394,7 +1904,6 @@
               </w:rPr>
               <w:t>organizationalFlatRate</w:t>
             </w:r>
-            <w:proofErr w:type="spellEnd"/>
             <w:r>
               <w:rPr>
                 <w:sz w:val="20"/>
@@ -2413,12 +1922,11 @@
         </w:tc>
         <w:tc>
           <w:tcPr>
-            <w:tcW w:w="4434" w:type="dxa"/>
+            <w:tcW w:w="3853" w:type="dxa"/>
             <w:tcBorders>
               <w:top w:val="single" w:sz="4" w:space="0" w:color="auto"/>
               <w:bottom w:val="single" w:sz="4" w:space="0" w:color="auto"/>
             </w:tcBorders>
-            <w:shd w:val="clear" w:color="auto" w:fill="auto"/>
           </w:tcPr>
           <w:p>
             <w:pPr>
@@ -2437,12 +1945,97 @@
         </w:trPr>
         <w:tc>
           <w:tcPr>
-            <w:tcW w:w="3709" w:type="dxa"/>
+            <w:tcW w:w="3367" w:type="dxa"/>
+            <w:tcBorders>
+              <w:top w:val="single" w:sz="4" w:space="0" w:color="auto"/>
+              <w:bottom w:val="single" w:sz="4" w:space="0" w:color="auto"/>
+            </w:tcBorders>
+          </w:tcPr>
+          <w:p>
+            <w:pPr>
+              <w:pStyle w:val="HTMLVorformatiert"/>
+              <w:shd w:val="clear" w:color="auto" w:fill="FFFFFF"/>
+              <w:rPr>
+                <w:rFonts w:ascii="Calibri" w:eastAsia="Calibri" w:hAnsi="Calibri" w:cs="Times New Roman"/>
+                <w:b/>
+                <w:bCs/>
+                <w:lang w:eastAsia="en-US"/>
+              </w:rPr>
+            </w:pPr>
+            <w:r>
+              <w:rPr>
+                <w:rFonts w:ascii="Calibri" w:eastAsia="Calibri" w:hAnsi="Calibri" w:cs="Times New Roman"/>
+                <w:b/>
+                <w:bCs/>
+                <w:lang w:eastAsia="en-US"/>
+              </w:rPr>
+              <w:t>Einnahmen für Sektion</w:t>
+            </w:r>
+          </w:p>
+        </w:tc>
+        <w:tc>
+          <w:tcPr>
+            <w:tcW w:w="2420" w:type="dxa"/>
+            <w:tcBorders>
+              <w:top w:val="single" w:sz="4" w:space="0" w:color="auto"/>
+              <w:bottom w:val="single" w:sz="4" w:space="0" w:color="auto"/>
+            </w:tcBorders>
+          </w:tcPr>
+          <w:p>
+            <w:pPr>
+              <w:spacing w:after="0" w:line="240" w:lineRule="auto"/>
+              <w:jc w:val="right"/>
+              <w:rPr>
+                <w:sz w:val="20"/>
+                <w:szCs w:val="20"/>
+              </w:rPr>
+            </w:pPr>
+            <w:r>
+              <w:rPr>
+                <w:sz w:val="20"/>
+                <w:szCs w:val="20"/>
+              </w:rPr>
+              <w:t>${revenueForSection} CHF</w:t>
+            </w:r>
+          </w:p>
+        </w:tc>
+        <w:tc>
+          <w:tcPr>
+            <w:tcW w:w="3853" w:type="dxa"/>
+            <w:tcBorders>
+              <w:top w:val="single" w:sz="4" w:space="0" w:color="auto"/>
+              <w:bottom w:val="single" w:sz="4" w:space="0" w:color="auto"/>
+            </w:tcBorders>
+          </w:tcPr>
+          <w:p>
+            <w:pPr>
+              <w:spacing w:after="0" w:line="240" w:lineRule="auto"/>
+              <w:rPr>
+                <w:sz w:val="20"/>
+                <w:szCs w:val="20"/>
+              </w:rPr>
+            </w:pPr>
+            <w:r>
+              <w:rPr>
+                <w:sz w:val="20"/>
+                <w:szCs w:val="20"/>
+              </w:rPr>
+              <w:t>${revenueForSectionInfoText}</w:t>
+            </w:r>
+          </w:p>
+        </w:tc>
+      </w:tr>
+      <w:tr>
+        <w:trPr>
+          <w:cantSplit/>
+        </w:trPr>
+        <w:tc>
+          <w:tcPr>
+            <w:tcW w:w="3367" w:type="dxa"/>
             <w:tcBorders>
               <w:top w:val="single" w:sz="4" w:space="0" w:color="auto"/>
               <w:bottom w:val="double" w:sz="4" w:space="0" w:color="auto"/>
             </w:tcBorders>
-            <w:shd w:val="clear" w:color="auto" w:fill="auto"/>
           </w:tcPr>
           <w:p>
             <w:pPr>
@@ -2465,12 +2058,11 @@
         </w:tc>
         <w:tc>
           <w:tcPr>
-            <w:tcW w:w="1604" w:type="dxa"/>
+            <w:tcW w:w="2420" w:type="dxa"/>
             <w:tcBorders>
               <w:top w:val="single" w:sz="4" w:space="0" w:color="auto"/>
               <w:bottom w:val="double" w:sz="4" w:space="0" w:color="auto"/>
             </w:tcBorders>
-            <w:shd w:val="clear" w:color="auto" w:fill="auto"/>
           </w:tcPr>
           <w:p>
             <w:pPr>
@@ -2488,36 +2080,17 @@
                 <w:sz w:val="20"/>
                 <w:szCs w:val="20"/>
               </w:rPr>
-              <w:t>${</w:t>
-            </w:r>
-            <w:proofErr w:type="spellStart"/>
-            <w:r>
-              <w:rPr>
-                <w:b/>
-                <w:sz w:val="20"/>
-                <w:szCs w:val="20"/>
-              </w:rPr>
-              <w:t>totalCosts</w:t>
-            </w:r>
-            <w:proofErr w:type="spellEnd"/>
-            <w:r>
-              <w:rPr>
-                <w:b/>
-                <w:sz w:val="20"/>
-                <w:szCs w:val="20"/>
-              </w:rPr>
-              <w:t>} CHF</w:t>
-            </w:r>
-          </w:p>
-        </w:tc>
-        <w:tc>
-          <w:tcPr>
-            <w:tcW w:w="4434" w:type="dxa"/>
+              <w:t>${totalCosts} CHF</w:t>
+            </w:r>
+          </w:p>
+        </w:tc>
+        <w:tc>
+          <w:tcPr>
+            <w:tcW w:w="3853" w:type="dxa"/>
             <w:tcBorders>
               <w:top w:val="single" w:sz="4" w:space="0" w:color="auto"/>
               <w:bottom w:val="double" w:sz="4" w:space="0" w:color="auto"/>
             </w:tcBorders>
-            <w:shd w:val="clear" w:color="auto" w:fill="auto"/>
           </w:tcPr>
           <w:p>
             <w:pPr>
@@ -2586,31 +2159,7 @@
           <w:sz w:val="20"/>
           <w:szCs w:val="20"/>
         </w:rPr>
-        <w:t xml:space="preserve"> x </w:t>
-      </w:r>
-      <w:proofErr w:type="spellStart"/>
-      <w:r>
-        <w:rPr>
-          <w:sz w:val="20"/>
-          <w:szCs w:val="20"/>
-        </w:rPr>
-        <w:t>AnzKm</w:t>
-      </w:r>
-      <w:proofErr w:type="spellEnd"/>
-      <w:r>
-        <w:rPr>
-          <w:sz w:val="20"/>
-          <w:szCs w:val="20"/>
-        </w:rPr>
-        <w:t xml:space="preserve"> + Park-/Strassen-/Tunnelgebühren) x </w:t>
-      </w:r>
-      <w:proofErr w:type="spellStart"/>
-      <w:r>
-        <w:rPr>
-          <w:sz w:val="20"/>
-          <w:szCs w:val="20"/>
-        </w:rPr>
-        <w:t>Anz</w:t>
+        <w:t xml:space="preserve"> x AnzKm + Park-/Strassen-/Tunnelgebühren) x Anz</w:t>
       </w:r>
       <w:r>
         <w:rPr>
@@ -2624,34 +2173,8 @@
           <w:sz w:val="20"/>
           <w:szCs w:val="20"/>
         </w:rPr>
-        <w:t>s</w:t>
+        <w:t>s) : AnzPersonen</w:t>
       </w:r>
-      <w:proofErr w:type="spellEnd"/>
-      <w:proofErr w:type="gramStart"/>
-      <w:r>
-        <w:rPr>
-          <w:sz w:val="20"/>
-          <w:szCs w:val="20"/>
-        </w:rPr>
-        <w:t>) :</w:t>
-      </w:r>
-      <w:proofErr w:type="gramEnd"/>
-      <w:r>
-        <w:rPr>
-          <w:sz w:val="20"/>
-          <w:szCs w:val="20"/>
-        </w:rPr>
-        <w:t xml:space="preserve"> </w:t>
-      </w:r>
-      <w:proofErr w:type="spellStart"/>
-      <w:r>
-        <w:rPr>
-          <w:sz w:val="20"/>
-          <w:szCs w:val="20"/>
-        </w:rPr>
-        <w:t>AnzPersonen</w:t>
-      </w:r>
-      <w:proofErr w:type="spellEnd"/>
       <w:r>
         <w:rPr>
           <w:sz w:val="20"/>
@@ -2681,23 +2204,7 @@
           <w:szCs w:val="20"/>
         </w:rPr>
         <w:br/>
-        <w:t>${</w:t>
-      </w:r>
-      <w:proofErr w:type="spellStart"/>
-      <w:r>
-        <w:rPr>
-          <w:sz w:val="20"/>
-          <w:szCs w:val="20"/>
-        </w:rPr>
-        <w:t>notice</w:t>
-      </w:r>
-      <w:proofErr w:type="spellEnd"/>
-      <w:r>
-        <w:rPr>
-          <w:sz w:val="20"/>
-          <w:szCs w:val="20"/>
-        </w:rPr>
-        <w:t>}</w:t>
+        <w:t>${notice}</w:t>
       </w:r>
     </w:p>
     <w:p>
@@ -2724,7 +2231,6 @@
         <w:tc>
           <w:tcPr>
             <w:tcW w:w="1838" w:type="dxa"/>
-            <w:shd w:val="clear" w:color="auto" w:fill="auto"/>
           </w:tcPr>
           <w:p>
             <w:pPr>
@@ -2746,38 +2252,21 @@
         <w:tc>
           <w:tcPr>
             <w:tcW w:w="7909" w:type="dxa"/>
-            <w:shd w:val="clear" w:color="auto" w:fill="auto"/>
-          </w:tcPr>
-          <w:p>
-            <w:pPr>
-              <w:spacing w:after="0" w:line="240" w:lineRule="auto"/>
-              <w:rPr>
-                <w:sz w:val="20"/>
-                <w:szCs w:val="20"/>
-              </w:rPr>
-            </w:pPr>
-            <w:r>
-              <w:rPr>
-                <w:sz w:val="20"/>
-                <w:szCs w:val="20"/>
-              </w:rPr>
-              <w:t>IBAN: ${</w:t>
-            </w:r>
-            <w:proofErr w:type="spellStart"/>
-            <w:r>
-              <w:rPr>
-                <w:sz w:val="20"/>
-                <w:szCs w:val="20"/>
-              </w:rPr>
-              <w:t>iban</w:t>
-            </w:r>
-            <w:proofErr w:type="spellEnd"/>
-            <w:r>
-              <w:rPr>
-                <w:sz w:val="20"/>
-                <w:szCs w:val="20"/>
-              </w:rPr>
-              <w:t>}</w:t>
+          </w:tcPr>
+          <w:p>
+            <w:pPr>
+              <w:spacing w:after="0" w:line="240" w:lineRule="auto"/>
+              <w:rPr>
+                <w:sz w:val="20"/>
+                <w:szCs w:val="20"/>
+              </w:rPr>
+            </w:pPr>
+            <w:r>
+              <w:rPr>
+                <w:sz w:val="20"/>
+                <w:szCs w:val="20"/>
+              </w:rPr>
+              <w:t>IBAN: ${iban}</w:t>
             </w:r>
           </w:p>
         </w:tc>
@@ -2789,7 +2278,6 @@
         <w:tc>
           <w:tcPr>
             <w:tcW w:w="1838" w:type="dxa"/>
-            <w:shd w:val="clear" w:color="auto" w:fill="auto"/>
           </w:tcPr>
           <w:p>
             <w:pPr>
@@ -2804,7 +2292,6 @@
         <w:tc>
           <w:tcPr>
             <w:tcW w:w="7909" w:type="dxa"/>
-            <w:shd w:val="clear" w:color="auto" w:fill="auto"/>
           </w:tcPr>
           <w:p>
             <w:pPr>
@@ -2826,23 +2313,7 @@
                 <w:sz w:val="20"/>
                 <w:szCs w:val="20"/>
               </w:rPr>
-              <w:t>${</w:t>
-            </w:r>
-            <w:proofErr w:type="spellStart"/>
-            <w:r>
-              <w:rPr>
-                <w:sz w:val="20"/>
-                <w:szCs w:val="20"/>
-              </w:rPr>
-              <w:t>accountHolder</w:t>
-            </w:r>
-            <w:proofErr w:type="spellEnd"/>
-            <w:r>
-              <w:rPr>
-                <w:sz w:val="20"/>
-                <w:szCs w:val="20"/>
-              </w:rPr>
-              <w:t>}</w:t>
+              <w:t>${accountHolder}</w:t>
             </w:r>
           </w:p>
         </w:tc>
@@ -2895,23 +2366,7 @@
           <w:sz w:val="20"/>
           <w:szCs w:val="20"/>
         </w:rPr>
-        <w:t>: ${</w:t>
-      </w:r>
-      <w:proofErr w:type="spellStart"/>
-      <w:r>
-        <w:rPr>
-          <w:sz w:val="20"/>
-          <w:szCs w:val="20"/>
-        </w:rPr>
-        <w:t>printingDate</w:t>
-      </w:r>
-      <w:proofErr w:type="spellEnd"/>
-      <w:r>
-        <w:rPr>
-          <w:sz w:val="20"/>
-          <w:szCs w:val="20"/>
-        </w:rPr>
-        <w:t>}</w:t>
+        <w:t>: ${printingDate}</w:t>
       </w:r>
     </w:p>
     <w:sectPr>
@@ -2926,7 +2381,7 @@
 </file>
 
 <file path=word/endnotes.xml><?xml version="1.0" encoding="utf-8"?>
-<w:endnotes xmlns:wpc="http://schemas.microsoft.com/office/word/2010/wordprocessingCanvas" xmlns:cx="http://schemas.microsoft.com/office/drawing/2014/chartex" xmlns:cx1="http://schemas.microsoft.com/office/drawing/2015/9/8/chartex" xmlns:cx2="http://schemas.microsoft.com/office/drawing/2015/10/21/chartex" xmlns:cx3="http://schemas.microsoft.com/office/drawing/2016/5/9/chartex" xmlns:cx4="http://schemas.microsoft.com/office/drawing/2016/5/10/chartex" xmlns:cx5="http://schemas.microsoft.com/office/drawing/2016/5/11/chartex" xmlns:cx6="http://schemas.microsoft.com/office/drawing/2016/5/12/chartex" xmlns:cx7="http://schemas.microsoft.com/office/drawing/2016/5/13/chartex" xmlns:cx8="http://schemas.microsoft.com/office/drawing/2016/5/14/chartex" xmlns:mc="http://schemas.openxmlformats.org/markup-compatibility/2006" xmlns:aink="http://schemas.microsoft.com/office/drawing/2016/ink" xmlns:am3d="http://schemas.microsoft.com/office/drawing/2017/model3d" xmlns:o="urn:schemas-microsoft-com:office:office" xmlns:oel="http://schemas.microsoft.com/office/2019/extlst" xmlns:r="http://schemas.openxmlformats.org/officeDocument/2006/relationships" xmlns:m="http://schemas.openxmlformats.org/officeDocument/2006/math" xmlns:v="urn:schemas-microsoft-com:vml" xmlns:wp14="http://schemas.microsoft.com/office/word/2010/wordprocessingDrawing" xmlns:wp="http://schemas.openxmlformats.org/drawingml/2006/wordprocessingDrawing" xmlns:w10="urn:schemas-microsoft-com:office:word" xmlns:w="http://schemas.openxmlformats.org/wordprocessingml/2006/main" xmlns:w14="http://schemas.microsoft.com/office/word/2010/wordml" xmlns:w15="http://schemas.microsoft.com/office/word/2012/wordml" xmlns:w16cex="http://schemas.microsoft.com/office/word/2018/wordml/cex" xmlns:w16cid="http://schemas.microsoft.com/office/word/2016/wordml/cid" xmlns:w16="http://schemas.microsoft.com/office/word/2018/wordml" xmlns:w16du="http://schemas.microsoft.com/office/word/2023/wordml/word16du" xmlns:w16sdtdh="http://schemas.microsoft.com/office/word/2020/wordml/sdtdatahash" xmlns:w16se="http://schemas.microsoft.com/office/word/2015/wordml/symex" xmlns:wpg="http://schemas.microsoft.com/office/word/2010/wordprocessingGroup" xmlns:wpi="http://schemas.microsoft.com/office/word/2010/wordprocessingInk" xmlns:wne="http://schemas.microsoft.com/office/word/2006/wordml" xmlns:wps="http://schemas.microsoft.com/office/word/2010/wordprocessingShape" mc:Ignorable="w14 w15 w16se w16cid w16 w16cex w16sdtdh w16du wp14">
+<w:endnotes xmlns:wpc="http://schemas.microsoft.com/office/word/2010/wordprocessingCanvas" xmlns:cx="http://schemas.microsoft.com/office/drawing/2014/chartex" xmlns:cx1="http://schemas.microsoft.com/office/drawing/2015/9/8/chartex" xmlns:cx2="http://schemas.microsoft.com/office/drawing/2015/10/21/chartex" xmlns:cx3="http://schemas.microsoft.com/office/drawing/2016/5/9/chartex" xmlns:cx4="http://schemas.microsoft.com/office/drawing/2016/5/10/chartex" xmlns:cx5="http://schemas.microsoft.com/office/drawing/2016/5/11/chartex" xmlns:cx6="http://schemas.microsoft.com/office/drawing/2016/5/12/chartex" xmlns:cx7="http://schemas.microsoft.com/office/drawing/2016/5/13/chartex" xmlns:cx8="http://schemas.microsoft.com/office/drawing/2016/5/14/chartex" xmlns:mc="http://schemas.openxmlformats.org/markup-compatibility/2006" xmlns:aink="http://schemas.microsoft.com/office/drawing/2016/ink" xmlns:am3d="http://schemas.microsoft.com/office/drawing/2017/model3d" xmlns:o="urn:schemas-microsoft-com:office:office" xmlns:oel="http://schemas.microsoft.com/office/2019/extlst" xmlns:r="http://schemas.openxmlformats.org/officeDocument/2006/relationships" xmlns:m="http://schemas.openxmlformats.org/officeDocument/2006/math" xmlns:v="urn:schemas-microsoft-com:vml" xmlns:wp14="http://schemas.microsoft.com/office/word/2010/wordprocessingDrawing" xmlns:wp="http://schemas.openxmlformats.org/drawingml/2006/wordprocessingDrawing" xmlns:w10="urn:schemas-microsoft-com:office:word" xmlns:w="http://schemas.openxmlformats.org/wordprocessingml/2006/main" xmlns:w14="http://schemas.microsoft.com/office/word/2010/wordml" xmlns:w15="http://schemas.microsoft.com/office/word/2012/wordml" xmlns:w16cex="http://schemas.microsoft.com/office/word/2018/wordml/cex" xmlns:w16cid="http://schemas.microsoft.com/office/word/2016/wordml/cid" xmlns:w16="http://schemas.microsoft.com/office/word/2018/wordml" xmlns:w16du="http://schemas.microsoft.com/office/word/2023/wordml/word16du" xmlns:w16sdtdh="http://schemas.microsoft.com/office/word/2020/wordml/sdtdatahash" xmlns:w16sdtfl="http://schemas.microsoft.com/office/word/2024/wordml/sdtformatlock" xmlns:w16se="http://schemas.microsoft.com/office/word/2015/wordml/symex" xmlns:wpg="http://schemas.microsoft.com/office/word/2010/wordprocessingGroup" xmlns:wpi="http://schemas.microsoft.com/office/word/2010/wordprocessingInk" xmlns:wne="http://schemas.microsoft.com/office/word/2006/wordml" xmlns:wps="http://schemas.microsoft.com/office/word/2010/wordprocessingShape" mc:Ignorable="w14 w15 w16se w16cid w16 w16cex w16sdtdh w16sdtfl w16du wp14">
   <w:endnote w:type="separator" w:id="-1">
     <w:p>
       <w:pPr>
@@ -2951,7 +2406,7 @@
 </file>
 
 <file path=word/footnotes.xml><?xml version="1.0" encoding="utf-8"?>
-<w:footnotes xmlns:wpc="http://schemas.microsoft.com/office/word/2010/wordprocessingCanvas" xmlns:cx="http://schemas.microsoft.com/office/drawing/2014/chartex" xmlns:cx1="http://schemas.microsoft.com/office/drawing/2015/9/8/chartex" xmlns:cx2="http://schemas.microsoft.com/office/drawing/2015/10/21/chartex" xmlns:cx3="http://schemas.microsoft.com/office/drawing/2016/5/9/chartex" xmlns:cx4="http://schemas.microsoft.com/office/drawing/2016/5/10/chartex" xmlns:cx5="http://schemas.microsoft.com/office/drawing/2016/5/11/chartex" xmlns:cx6="http://schemas.microsoft.com/office/drawing/2016/5/12/chartex" xmlns:cx7="http://schemas.microsoft.com/office/drawing/2016/5/13/chartex" xmlns:cx8="http://schemas.microsoft.com/office/drawing/2016/5/14/chartex" xmlns:mc="http://schemas.openxmlformats.org/markup-compatibility/2006" xmlns:aink="http://schemas.microsoft.com/office/drawing/2016/ink" xmlns:am3d="http://schemas.microsoft.com/office/drawing/2017/model3d" xmlns:o="urn:schemas-microsoft-com:office:office" xmlns:oel="http://schemas.microsoft.com/office/2019/extlst" xmlns:r="http://schemas.openxmlformats.org/officeDocument/2006/relationships" xmlns:m="http://schemas.openxmlformats.org/officeDocument/2006/math" xmlns:v="urn:schemas-microsoft-com:vml" xmlns:wp14="http://schemas.microsoft.com/office/word/2010/wordprocessingDrawing" xmlns:wp="http://schemas.openxmlformats.org/drawingml/2006/wordprocessingDrawing" xmlns:w10="urn:schemas-microsoft-com:office:word" xmlns:w="http://schemas.openxmlformats.org/wordprocessingml/2006/main" xmlns:w14="http://schemas.microsoft.com/office/word/2010/wordml" xmlns:w15="http://schemas.microsoft.com/office/word/2012/wordml" xmlns:w16cex="http://schemas.microsoft.com/office/word/2018/wordml/cex" xmlns:w16cid="http://schemas.microsoft.com/office/word/2016/wordml/cid" xmlns:w16="http://schemas.microsoft.com/office/word/2018/wordml" xmlns:w16du="http://schemas.microsoft.com/office/word/2023/wordml/word16du" xmlns:w16sdtdh="http://schemas.microsoft.com/office/word/2020/wordml/sdtdatahash" xmlns:w16se="http://schemas.microsoft.com/office/word/2015/wordml/symex" xmlns:wpg="http://schemas.microsoft.com/office/word/2010/wordprocessingGroup" xmlns:wpi="http://schemas.microsoft.com/office/word/2010/wordprocessingInk" xmlns:wne="http://schemas.microsoft.com/office/word/2006/wordml" xmlns:wps="http://schemas.microsoft.com/office/word/2010/wordprocessingShape" mc:Ignorable="w14 w15 w16se w16cid w16 w16cex w16sdtdh w16du wp14">
+<w:footnotes xmlns:wpc="http://schemas.microsoft.com/office/word/2010/wordprocessingCanvas" xmlns:cx="http://schemas.microsoft.com/office/drawing/2014/chartex" xmlns:cx1="http://schemas.microsoft.com/office/drawing/2015/9/8/chartex" xmlns:cx2="http://schemas.microsoft.com/office/drawing/2015/10/21/chartex" xmlns:cx3="http://schemas.microsoft.com/office/drawing/2016/5/9/chartex" xmlns:cx4="http://schemas.microsoft.com/office/drawing/2016/5/10/chartex" xmlns:cx5="http://schemas.microsoft.com/office/drawing/2016/5/11/chartex" xmlns:cx6="http://schemas.microsoft.com/office/drawing/2016/5/12/chartex" xmlns:cx7="http://schemas.microsoft.com/office/drawing/2016/5/13/chartex" xmlns:cx8="http://schemas.microsoft.com/office/drawing/2016/5/14/chartex" xmlns:mc="http://schemas.openxmlformats.org/markup-compatibility/2006" xmlns:aink="http://schemas.microsoft.com/office/drawing/2016/ink" xmlns:am3d="http://schemas.microsoft.com/office/drawing/2017/model3d" xmlns:o="urn:schemas-microsoft-com:office:office" xmlns:oel="http://schemas.microsoft.com/office/2019/extlst" xmlns:r="http://schemas.openxmlformats.org/officeDocument/2006/relationships" xmlns:m="http://schemas.openxmlformats.org/officeDocument/2006/math" xmlns:v="urn:schemas-microsoft-com:vml" xmlns:wp14="http://schemas.microsoft.com/office/word/2010/wordprocessingDrawing" xmlns:wp="http://schemas.openxmlformats.org/drawingml/2006/wordprocessingDrawing" xmlns:w10="urn:schemas-microsoft-com:office:word" xmlns:w="http://schemas.openxmlformats.org/wordprocessingml/2006/main" xmlns:w14="http://schemas.microsoft.com/office/word/2010/wordml" xmlns:w15="http://schemas.microsoft.com/office/word/2012/wordml" xmlns:w16cex="http://schemas.microsoft.com/office/word/2018/wordml/cex" xmlns:w16cid="http://schemas.microsoft.com/office/word/2016/wordml/cid" xmlns:w16="http://schemas.microsoft.com/office/word/2018/wordml" xmlns:w16du="http://schemas.microsoft.com/office/word/2023/wordml/word16du" xmlns:w16sdtdh="http://schemas.microsoft.com/office/word/2020/wordml/sdtdatahash" xmlns:w16sdtfl="http://schemas.microsoft.com/office/word/2024/wordml/sdtformatlock" xmlns:w16se="http://schemas.microsoft.com/office/word/2015/wordml/symex" xmlns:wpg="http://schemas.microsoft.com/office/word/2010/wordprocessingGroup" xmlns:wpi="http://schemas.microsoft.com/office/word/2010/wordprocessingInk" xmlns:wne="http://schemas.microsoft.com/office/word/2006/wordml" xmlns:wps="http://schemas.microsoft.com/office/word/2010/wordprocessingShape" mc:Ignorable="w14 w15 w16se w16cid w16 w16cex w16sdtdh w16sdtfl w16du wp14">
   <w:footnote w:type="separator" w:id="-1">
     <w:p>
       <w:pPr>
@@ -2976,7 +2431,7 @@
 </file>
 
 <file path=word/header1.xml><?xml version="1.0" encoding="utf-8"?>
-<w:hdr xmlns:wpc="http://schemas.microsoft.com/office/word/2010/wordprocessingCanvas" xmlns:cx="http://schemas.microsoft.com/office/drawing/2014/chartex" xmlns:cx1="http://schemas.microsoft.com/office/drawing/2015/9/8/chartex" xmlns:cx2="http://schemas.microsoft.com/office/drawing/2015/10/21/chartex" xmlns:cx3="http://schemas.microsoft.com/office/drawing/2016/5/9/chartex" xmlns:cx4="http://schemas.microsoft.com/office/drawing/2016/5/10/chartex" xmlns:cx5="http://schemas.microsoft.com/office/drawing/2016/5/11/chartex" xmlns:cx6="http://schemas.microsoft.com/office/drawing/2016/5/12/chartex" xmlns:cx7="http://schemas.microsoft.com/office/drawing/2016/5/13/chartex" xmlns:cx8="http://schemas.microsoft.com/office/drawing/2016/5/14/chartex" xmlns:mc="http://schemas.openxmlformats.org/markup-compatibility/2006" xmlns:aink="http://schemas.microsoft.com/office/drawing/2016/ink" xmlns:am3d="http://schemas.microsoft.com/office/drawing/2017/model3d" xmlns:o="urn:schemas-microsoft-com:office:office" xmlns:oel="http://schemas.microsoft.com/office/2019/extlst" xmlns:r="http://schemas.openxmlformats.org/officeDocument/2006/relationships" xmlns:m="http://schemas.openxmlformats.org/officeDocument/2006/math" xmlns:v="urn:schemas-microsoft-com:vml" xmlns:wp14="http://schemas.microsoft.com/office/word/2010/wordprocessingDrawing" xmlns:wp="http://schemas.openxmlformats.org/drawingml/2006/wordprocessingDrawing" xmlns:w10="urn:schemas-microsoft-com:office:word" xmlns:w="http://schemas.openxmlformats.org/wordprocessingml/2006/main" xmlns:w14="http://schemas.microsoft.com/office/word/2010/wordml" xmlns:w15="http://schemas.microsoft.com/office/word/2012/wordml" xmlns:w16cex="http://schemas.microsoft.com/office/word/2018/wordml/cex" xmlns:w16cid="http://schemas.microsoft.com/office/word/2016/wordml/cid" xmlns:w16="http://schemas.microsoft.com/office/word/2018/wordml" xmlns:w16du="http://schemas.microsoft.com/office/word/2023/wordml/word16du" xmlns:w16sdtdh="http://schemas.microsoft.com/office/word/2020/wordml/sdtdatahash" xmlns:w16se="http://schemas.microsoft.com/office/word/2015/wordml/symex" xmlns:wpg="http://schemas.microsoft.com/office/word/2010/wordprocessingGroup" xmlns:wpi="http://schemas.microsoft.com/office/word/2010/wordprocessingInk" xmlns:wne="http://schemas.microsoft.com/office/word/2006/wordml" xmlns:wps="http://schemas.microsoft.com/office/word/2010/wordprocessingShape" mc:Ignorable="w14 w15 w16se w16cid w16 w16cex w16sdtdh w16du wp14">
+<w:hdr xmlns:wpc="http://schemas.microsoft.com/office/word/2010/wordprocessingCanvas" xmlns:cx="http://schemas.microsoft.com/office/drawing/2014/chartex" xmlns:cx1="http://schemas.microsoft.com/office/drawing/2015/9/8/chartex" xmlns:cx2="http://schemas.microsoft.com/office/drawing/2015/10/21/chartex" xmlns:cx3="http://schemas.microsoft.com/office/drawing/2016/5/9/chartex" xmlns:cx4="http://schemas.microsoft.com/office/drawing/2016/5/10/chartex" xmlns:cx5="http://schemas.microsoft.com/office/drawing/2016/5/11/chartex" xmlns:cx6="http://schemas.microsoft.com/office/drawing/2016/5/12/chartex" xmlns:cx7="http://schemas.microsoft.com/office/drawing/2016/5/13/chartex" xmlns:cx8="http://schemas.microsoft.com/office/drawing/2016/5/14/chartex" xmlns:mc="http://schemas.openxmlformats.org/markup-compatibility/2006" xmlns:aink="http://schemas.microsoft.com/office/drawing/2016/ink" xmlns:am3d="http://schemas.microsoft.com/office/drawing/2017/model3d" xmlns:o="urn:schemas-microsoft-com:office:office" xmlns:oel="http://schemas.microsoft.com/office/2019/extlst" xmlns:r="http://schemas.openxmlformats.org/officeDocument/2006/relationships" xmlns:m="http://schemas.openxmlformats.org/officeDocument/2006/math" xmlns:v="urn:schemas-microsoft-com:vml" xmlns:wp14="http://schemas.microsoft.com/office/word/2010/wordprocessingDrawing" xmlns:wp="http://schemas.openxmlformats.org/drawingml/2006/wordprocessingDrawing" xmlns:w10="urn:schemas-microsoft-com:office:word" xmlns:w="http://schemas.openxmlformats.org/wordprocessingml/2006/main" xmlns:w14="http://schemas.microsoft.com/office/word/2010/wordml" xmlns:w15="http://schemas.microsoft.com/office/word/2012/wordml" xmlns:w16cex="http://schemas.microsoft.com/office/word/2018/wordml/cex" xmlns:w16cid="http://schemas.microsoft.com/office/word/2016/wordml/cid" xmlns:w16="http://schemas.microsoft.com/office/word/2018/wordml" xmlns:w16du="http://schemas.microsoft.com/office/word/2023/wordml/word16du" xmlns:w16sdtdh="http://schemas.microsoft.com/office/word/2020/wordml/sdtdatahash" xmlns:w16sdtfl="http://schemas.microsoft.com/office/word/2024/wordml/sdtformatlock" xmlns:w16se="http://schemas.microsoft.com/office/word/2015/wordml/symex" xmlns:wpg="http://schemas.microsoft.com/office/word/2010/wordprocessingGroup" xmlns:wpi="http://schemas.microsoft.com/office/word/2010/wordprocessingInk" xmlns:wne="http://schemas.microsoft.com/office/word/2006/wordml" xmlns:wps="http://schemas.microsoft.com/office/word/2010/wordprocessingShape" mc:Ignorable="w14 w15 w16se w16cid w16 w16cex w16sdtdh w16sdtfl w16du wp14">
   <w:p>
     <w:pPr>
       <w:pStyle w:val="Kopfzeile"/>
@@ -3036,7 +2491,7 @@
 </file>
 
 <file path=word/numbering.xml><?xml version="1.0" encoding="utf-8"?>
-<w:numbering xmlns:wpc="http://schemas.microsoft.com/office/word/2010/wordprocessingCanvas" xmlns:cx="http://schemas.microsoft.com/office/drawing/2014/chartex" xmlns:cx1="http://schemas.microsoft.com/office/drawing/2015/9/8/chartex" xmlns:cx2="http://schemas.microsoft.com/office/drawing/2015/10/21/chartex" xmlns:cx3="http://schemas.microsoft.com/office/drawing/2016/5/9/chartex" xmlns:cx4="http://schemas.microsoft.com/office/drawing/2016/5/10/chartex" xmlns:cx5="http://schemas.microsoft.com/office/drawing/2016/5/11/chartex" xmlns:cx6="http://schemas.microsoft.com/office/drawing/2016/5/12/chartex" xmlns:cx7="http://schemas.microsoft.com/office/drawing/2016/5/13/chartex" xmlns:cx8="http://schemas.microsoft.com/office/drawing/2016/5/14/chartex" xmlns:mc="http://schemas.openxmlformats.org/markup-compatibility/2006" xmlns:aink="http://schemas.microsoft.com/office/drawing/2016/ink" xmlns:am3d="http://schemas.microsoft.com/office/drawing/2017/model3d" xmlns:o="urn:schemas-microsoft-com:office:office" xmlns:oel="http://schemas.microsoft.com/office/2019/extlst" xmlns:r="http://schemas.openxmlformats.org/officeDocument/2006/relationships" xmlns:m="http://schemas.openxmlformats.org/officeDocument/2006/math" xmlns:v="urn:schemas-microsoft-com:vml" xmlns:wp14="http://schemas.microsoft.com/office/word/2010/wordprocessingDrawing" xmlns:wp="http://schemas.openxmlformats.org/drawingml/2006/wordprocessingDrawing" xmlns:w10="urn:schemas-microsoft-com:office:word" xmlns:w="http://schemas.openxmlformats.org/wordprocessingml/2006/main" xmlns:w14="http://schemas.microsoft.com/office/word/2010/wordml" xmlns:w15="http://schemas.microsoft.com/office/word/2012/wordml" xmlns:w16cex="http://schemas.microsoft.com/office/word/2018/wordml/cex" xmlns:w16cid="http://schemas.microsoft.com/office/word/2016/wordml/cid" xmlns:w16="http://schemas.microsoft.com/office/word/2018/wordml" xmlns:w16du="http://schemas.microsoft.com/office/word/2023/wordml/word16du" xmlns:w16sdtdh="http://schemas.microsoft.com/office/word/2020/wordml/sdtdatahash" xmlns:w16se="http://schemas.microsoft.com/office/word/2015/wordml/symex" xmlns:wpg="http://schemas.microsoft.com/office/word/2010/wordprocessingGroup" xmlns:wpi="http://schemas.microsoft.com/office/word/2010/wordprocessingInk" xmlns:wne="http://schemas.microsoft.com/office/word/2006/wordml" xmlns:wps="http://schemas.microsoft.com/office/word/2010/wordprocessingShape" mc:Ignorable="w14 w15 w16se w16cid w16 w16cex w16sdtdh w16du wp14">
+<w:numbering xmlns:wpc="http://schemas.microsoft.com/office/word/2010/wordprocessingCanvas" xmlns:cx="http://schemas.microsoft.com/office/drawing/2014/chartex" xmlns:cx1="http://schemas.microsoft.com/office/drawing/2015/9/8/chartex" xmlns:cx2="http://schemas.microsoft.com/office/drawing/2015/10/21/chartex" xmlns:cx3="http://schemas.microsoft.com/office/drawing/2016/5/9/chartex" xmlns:cx4="http://schemas.microsoft.com/office/drawing/2016/5/10/chartex" xmlns:cx5="http://schemas.microsoft.com/office/drawing/2016/5/11/chartex" xmlns:cx6="http://schemas.microsoft.com/office/drawing/2016/5/12/chartex" xmlns:cx7="http://schemas.microsoft.com/office/drawing/2016/5/13/chartex" xmlns:cx8="http://schemas.microsoft.com/office/drawing/2016/5/14/chartex" xmlns:mc="http://schemas.openxmlformats.org/markup-compatibility/2006" xmlns:aink="http://schemas.microsoft.com/office/drawing/2016/ink" xmlns:am3d="http://schemas.microsoft.com/office/drawing/2017/model3d" xmlns:o="urn:schemas-microsoft-com:office:office" xmlns:oel="http://schemas.microsoft.com/office/2019/extlst" xmlns:r="http://schemas.openxmlformats.org/officeDocument/2006/relationships" xmlns:m="http://schemas.openxmlformats.org/officeDocument/2006/math" xmlns:v="urn:schemas-microsoft-com:vml" xmlns:wp14="http://schemas.microsoft.com/office/word/2010/wordprocessingDrawing" xmlns:wp="http://schemas.openxmlformats.org/drawingml/2006/wordprocessingDrawing" xmlns:w10="urn:schemas-microsoft-com:office:word" xmlns:w="http://schemas.openxmlformats.org/wordprocessingml/2006/main" xmlns:w14="http://schemas.microsoft.com/office/word/2010/wordml" xmlns:w15="http://schemas.microsoft.com/office/word/2012/wordml" xmlns:w16cex="http://schemas.microsoft.com/office/word/2018/wordml/cex" xmlns:w16cid="http://schemas.microsoft.com/office/word/2016/wordml/cid" xmlns:w16="http://schemas.microsoft.com/office/word/2018/wordml" xmlns:w16du="http://schemas.microsoft.com/office/word/2023/wordml/word16du" xmlns:w16sdtdh="http://schemas.microsoft.com/office/word/2020/wordml/sdtdatahash" xmlns:w16sdtfl="http://schemas.microsoft.com/office/word/2024/wordml/sdtformatlock" xmlns:w16se="http://schemas.microsoft.com/office/word/2015/wordml/symex" xmlns:wpg="http://schemas.microsoft.com/office/word/2010/wordprocessingGroup" xmlns:wpi="http://schemas.microsoft.com/office/word/2010/wordprocessingInk" xmlns:wne="http://schemas.microsoft.com/office/word/2006/wordml" xmlns:wps="http://schemas.microsoft.com/office/word/2010/wordprocessingShape" mc:Ignorable="w14 w15 w16se w16cid w16 w16cex w16sdtdh w16sdtfl w16du wp14">
   <w:abstractNum w:abstractNumId="0" w15:restartNumberingAfterBreak="0">
     <w:nsid w:val="09B04B5C"/>
     <w:multiLevelType w:val="hybridMultilevel"/>
@@ -3360,7 +2815,7 @@
 </file>
 
 <file path=word/styles.xml><?xml version="1.0" encoding="utf-8"?>
-<w:styles xmlns:mc="http://schemas.openxmlformats.org/markup-compatibility/2006" xmlns:r="http://schemas.openxmlformats.org/officeDocument/2006/relationships" xmlns:w="http://schemas.openxmlformats.org/wordprocessingml/2006/main" xmlns:w14="http://schemas.microsoft.com/office/word/2010/wordml" xmlns:w15="http://schemas.microsoft.com/office/word/2012/wordml" xmlns:w16cex="http://schemas.microsoft.com/office/word/2018/wordml/cex" xmlns:w16cid="http://schemas.microsoft.com/office/word/2016/wordml/cid" xmlns:w16="http://schemas.microsoft.com/office/word/2018/wordml" xmlns:w16du="http://schemas.microsoft.com/office/word/2023/wordml/word16du" xmlns:w16sdtdh="http://schemas.microsoft.com/office/word/2020/wordml/sdtdatahash" xmlns:w16se="http://schemas.microsoft.com/office/word/2015/wordml/symex" mc:Ignorable="w14 w15 w16se w16cid w16 w16cex w16sdtdh w16du">
+<w:styles xmlns:mc="http://schemas.openxmlformats.org/markup-compatibility/2006" xmlns:r="http://schemas.openxmlformats.org/officeDocument/2006/relationships" xmlns:w="http://schemas.openxmlformats.org/wordprocessingml/2006/main" xmlns:w14="http://schemas.microsoft.com/office/word/2010/wordml" xmlns:w15="http://schemas.microsoft.com/office/word/2012/wordml" xmlns:w16cex="http://schemas.microsoft.com/office/word/2018/wordml/cex" xmlns:w16cid="http://schemas.microsoft.com/office/word/2016/wordml/cid" xmlns:w16="http://schemas.microsoft.com/office/word/2018/wordml" xmlns:w16du="http://schemas.microsoft.com/office/word/2023/wordml/word16du" xmlns:w16sdtdh="http://schemas.microsoft.com/office/word/2020/wordml/sdtdatahash" xmlns:w16sdtfl="http://schemas.microsoft.com/office/word/2024/wordml/sdtformatlock" xmlns:w16se="http://schemas.microsoft.com/office/word/2015/wordml/symex" mc:Ignorable="w14 w15 w16se w16cid w16 w16cex w16sdtdh w16sdtfl w16du">
   <w:docDefaults>
     <w:rPrDefault>
       <w:rPr>

</xml_diff>

<commit_message>
Add age group distribution logic and placeholders in DOCX templates
Introduced age group counting functionality in `Event.php` using `AgeGroupUtil`. Added placeholders to DOCX templates for displaying participant age distribution. Updated logic to differentiate between J&S, youth, and adult categories.

https://github.com/jonasmueller1/sac-pilatus-website/issues/141
</commit_message>
<xml_diff>
--- a/contao/templates/docx/event_invoice_tour.docx
+++ b/contao/templates/docx/event_invoice_tour.docx
@@ -140,7 +140,23 @@
                 <w:sz w:val="20"/>
                 <w:szCs w:val="20"/>
               </w:rPr>
-              <w:t>${eventTitle}</w:t>
+              <w:t>${</w:t>
+            </w:r>
+            <w:proofErr w:type="spellStart"/>
+            <w:r>
+              <w:rPr>
+                <w:sz w:val="20"/>
+                <w:szCs w:val="20"/>
+              </w:rPr>
+              <w:t>eventTitle</w:t>
+            </w:r>
+            <w:proofErr w:type="spellEnd"/>
+            <w:r>
+              <w:rPr>
+                <w:sz w:val="20"/>
+                <w:szCs w:val="20"/>
+              </w:rPr>
+              <w:t>}</w:t>
             </w:r>
           </w:p>
         </w:tc>
@@ -196,7 +212,23 @@
                 <w:sz w:val="20"/>
                 <w:szCs w:val="20"/>
               </w:rPr>
-              <w:t>${eventTransport}</w:t>
+              <w:t>${</w:t>
+            </w:r>
+            <w:proofErr w:type="spellStart"/>
+            <w:r>
+              <w:rPr>
+                <w:sz w:val="20"/>
+                <w:szCs w:val="20"/>
+              </w:rPr>
+              <w:t>eventTransport</w:t>
+            </w:r>
+            <w:proofErr w:type="spellEnd"/>
+            <w:r>
+              <w:rPr>
+                <w:sz w:val="20"/>
+                <w:szCs w:val="20"/>
+              </w:rPr>
+              <w:t>}</w:t>
             </w:r>
           </w:p>
         </w:tc>
@@ -254,7 +286,23 @@
                 <w:sz w:val="20"/>
                 <w:szCs w:val="20"/>
               </w:rPr>
-              <w:t>${eventDates}</w:t>
+              <w:t>${</w:t>
+            </w:r>
+            <w:proofErr w:type="spellStart"/>
+            <w:r>
+              <w:rPr>
+                <w:sz w:val="20"/>
+                <w:szCs w:val="20"/>
+              </w:rPr>
+              <w:t>eventDates</w:t>
+            </w:r>
+            <w:proofErr w:type="spellEnd"/>
+            <w:r>
+              <w:rPr>
+                <w:sz w:val="20"/>
+                <w:szCs w:val="20"/>
+              </w:rPr>
+              <w:t>}</w:t>
             </w:r>
           </w:p>
         </w:tc>
@@ -310,7 +358,23 @@
                 <w:sz w:val="20"/>
                 <w:szCs w:val="20"/>
               </w:rPr>
-              <w:t>${eventDuration}</w:t>
+              <w:t>${</w:t>
+            </w:r>
+            <w:proofErr w:type="spellStart"/>
+            <w:r>
+              <w:rPr>
+                <w:sz w:val="20"/>
+                <w:szCs w:val="20"/>
+              </w:rPr>
+              <w:t>eventDuration</w:t>
+            </w:r>
+            <w:proofErr w:type="spellEnd"/>
+            <w:r>
+              <w:rPr>
+                <w:sz w:val="20"/>
+                <w:szCs w:val="20"/>
+              </w:rPr>
+              <w:t>}</w:t>
             </w:r>
           </w:p>
         </w:tc>
@@ -361,7 +425,15 @@
                 <w:sz w:val="20"/>
                 <w:szCs w:val="20"/>
               </w:rPr>
-              <w:t xml:space="preserve"> ${eventHasExecuted</w:t>
+              <w:t xml:space="preserve"> ${</w:t>
+            </w:r>
+            <w:proofErr w:type="spellStart"/>
+            <w:r>
+              <w:rPr>
+                <w:sz w:val="20"/>
+                <w:szCs w:val="20"/>
+              </w:rPr>
+              <w:t>eventHasExecuted</w:t>
             </w:r>
             <w:r>
               <w:rPr>
@@ -370,6 +442,7 @@
               </w:rPr>
               <w:t>LikePredicted</w:t>
             </w:r>
+            <w:proofErr w:type="spellEnd"/>
             <w:r>
               <w:rPr>
                 <w:sz w:val="20"/>
@@ -418,14 +491,30 @@
                 <w:sz w:val="20"/>
                 <w:szCs w:val="20"/>
               </w:rPr>
-              <w:t>${event</w:t>
-            </w:r>
-            <w:r>
-              <w:rPr>
-                <w:sz w:val="20"/>
-                <w:szCs w:val="20"/>
-              </w:rPr>
-              <w:t>Canceled}</w:t>
+              <w:t>${</w:t>
+            </w:r>
+            <w:proofErr w:type="spellStart"/>
+            <w:r>
+              <w:rPr>
+                <w:sz w:val="20"/>
+                <w:szCs w:val="20"/>
+              </w:rPr>
+              <w:t>event</w:t>
+            </w:r>
+            <w:r>
+              <w:rPr>
+                <w:sz w:val="20"/>
+                <w:szCs w:val="20"/>
+              </w:rPr>
+              <w:t>Canceled</w:t>
+            </w:r>
+            <w:proofErr w:type="spellEnd"/>
+            <w:r>
+              <w:rPr>
+                <w:sz w:val="20"/>
+                <w:szCs w:val="20"/>
+              </w:rPr>
+              <w:t>}</w:t>
             </w:r>
           </w:p>
         </w:tc>
@@ -510,7 +599,23 @@
                 <w:sz w:val="20"/>
                 <w:szCs w:val="20"/>
               </w:rPr>
-              <w:t>${eventSubstitutionText}</w:t>
+              <w:t>${</w:t>
+            </w:r>
+            <w:proofErr w:type="spellStart"/>
+            <w:r>
+              <w:rPr>
+                <w:sz w:val="20"/>
+                <w:szCs w:val="20"/>
+              </w:rPr>
+              <w:t>eventSubstitutionText</w:t>
+            </w:r>
+            <w:proofErr w:type="spellEnd"/>
+            <w:r>
+              <w:rPr>
+                <w:sz w:val="20"/>
+                <w:szCs w:val="20"/>
+              </w:rPr>
+              <w:t>}</w:t>
             </w:r>
           </w:p>
           <w:p>
@@ -631,7 +736,23 @@
                 <w:sz w:val="20"/>
                 <w:szCs w:val="20"/>
               </w:rPr>
-              <w:t>${eventInstructorName}</w:t>
+              <w:t>${</w:t>
+            </w:r>
+            <w:proofErr w:type="spellStart"/>
+            <w:r>
+              <w:rPr>
+                <w:sz w:val="20"/>
+                <w:szCs w:val="20"/>
+              </w:rPr>
+              <w:t>eventInstructorName</w:t>
+            </w:r>
+            <w:proofErr w:type="spellEnd"/>
+            <w:r>
+              <w:rPr>
+                <w:sz w:val="20"/>
+                <w:szCs w:val="20"/>
+              </w:rPr>
+              <w:t>}</w:t>
             </w:r>
           </w:p>
         </w:tc>
@@ -690,7 +811,23 @@
                 <w:sz w:val="20"/>
                 <w:szCs w:val="20"/>
               </w:rPr>
-              <w:t>${eventInstructorStreet}</w:t>
+              <w:t>${</w:t>
+            </w:r>
+            <w:proofErr w:type="spellStart"/>
+            <w:r>
+              <w:rPr>
+                <w:sz w:val="20"/>
+                <w:szCs w:val="20"/>
+              </w:rPr>
+              <w:t>eventInstructorStreet</w:t>
+            </w:r>
+            <w:proofErr w:type="spellEnd"/>
+            <w:r>
+              <w:rPr>
+                <w:sz w:val="20"/>
+                <w:szCs w:val="20"/>
+              </w:rPr>
+              <w:t>}</w:t>
             </w:r>
           </w:p>
         </w:tc>
@@ -749,7 +886,23 @@
                 <w:sz w:val="20"/>
                 <w:szCs w:val="20"/>
               </w:rPr>
-              <w:t>${eventInstructorPostalCity}</w:t>
+              <w:t>${</w:t>
+            </w:r>
+            <w:proofErr w:type="spellStart"/>
+            <w:r>
+              <w:rPr>
+                <w:sz w:val="20"/>
+                <w:szCs w:val="20"/>
+              </w:rPr>
+              <w:t>eventInstructorPostalCity</w:t>
+            </w:r>
+            <w:proofErr w:type="spellEnd"/>
+            <w:r>
+              <w:rPr>
+                <w:sz w:val="20"/>
+                <w:szCs w:val="20"/>
+              </w:rPr>
+              <w:t>}</w:t>
             </w:r>
           </w:p>
         </w:tc>
@@ -811,7 +964,23 @@
                 <w:sz w:val="20"/>
                 <w:szCs w:val="20"/>
               </w:rPr>
-              <w:t>${eventInstructorPhone}</w:t>
+              <w:t>${</w:t>
+            </w:r>
+            <w:proofErr w:type="spellStart"/>
+            <w:r>
+              <w:rPr>
+                <w:sz w:val="20"/>
+                <w:szCs w:val="20"/>
+              </w:rPr>
+              <w:t>eventInstructorPhone</w:t>
+            </w:r>
+            <w:proofErr w:type="spellEnd"/>
+            <w:r>
+              <w:rPr>
+                <w:sz w:val="20"/>
+                <w:szCs w:val="20"/>
+              </w:rPr>
+              <w:t>}</w:t>
             </w:r>
           </w:p>
         </w:tc>
@@ -866,7 +1035,23 @@
                 <w:sz w:val="20"/>
                 <w:szCs w:val="20"/>
               </w:rPr>
-              <w:t>${countParticipants}</w:t>
+              <w:t>${</w:t>
+            </w:r>
+            <w:proofErr w:type="spellStart"/>
+            <w:r>
+              <w:rPr>
+                <w:sz w:val="20"/>
+                <w:szCs w:val="20"/>
+              </w:rPr>
+              <w:t>countParticipants</w:t>
+            </w:r>
+            <w:proofErr w:type="spellEnd"/>
+            <w:r>
+              <w:rPr>
+                <w:sz w:val="20"/>
+                <w:szCs w:val="20"/>
+              </w:rPr>
+              <w:t>}</w:t>
             </w:r>
           </w:p>
         </w:tc>
@@ -880,14 +1065,77 @@
               <w:rPr>
                 <w:sz w:val="20"/>
                 <w:szCs w:val="20"/>
-              </w:rPr>
-            </w:pPr>
-            <w:r>
-              <w:rPr>
-                <w:sz w:val="20"/>
-                <w:szCs w:val="20"/>
-              </w:rPr>
-              <w:t>${countFemale} W und ${countMale} M</w:t>
+                <w:lang w:val="en-GB"/>
+              </w:rPr>
+            </w:pPr>
+            <w:r>
+              <w:rPr>
+                <w:sz w:val="20"/>
+                <w:szCs w:val="20"/>
+                <w:lang w:val="en-GB"/>
+              </w:rPr>
+              <w:t>${</w:t>
+            </w:r>
+            <w:proofErr w:type="spellStart"/>
+            <w:r>
+              <w:rPr>
+                <w:sz w:val="20"/>
+                <w:szCs w:val="20"/>
+                <w:lang w:val="en-GB"/>
+              </w:rPr>
+              <w:t>countFemale</w:t>
+            </w:r>
+            <w:proofErr w:type="spellEnd"/>
+            <w:r>
+              <w:rPr>
+                <w:sz w:val="20"/>
+                <w:szCs w:val="20"/>
+                <w:lang w:val="en-GB"/>
+              </w:rPr>
+              <w:t>} W und ${</w:t>
+            </w:r>
+            <w:proofErr w:type="spellStart"/>
+            <w:r>
+              <w:rPr>
+                <w:sz w:val="20"/>
+                <w:szCs w:val="20"/>
+                <w:lang w:val="en-GB"/>
+              </w:rPr>
+              <w:t>countMale</w:t>
+            </w:r>
+            <w:proofErr w:type="spellEnd"/>
+            <w:r>
+              <w:rPr>
+                <w:sz w:val="20"/>
+                <w:szCs w:val="20"/>
+                <w:lang w:val="en-GB"/>
+              </w:rPr>
+              <w:t>} M</w:t>
+            </w:r>
+          </w:p>
+          <w:p>
+            <w:pPr>
+              <w:rPr>
+                <w:sz w:val="20"/>
+                <w:szCs w:val="20"/>
+                <w:lang w:val="en-GB"/>
+              </w:rPr>
+            </w:pPr>
+            <w:r>
+              <w:rPr>
+                <w:sz w:val="20"/>
+                <w:szCs w:val="20"/>
+                <w:lang w:val="en-GB"/>
+              </w:rPr>
+              <w:t>${</w:t>
+            </w:r>
+            <w:proofErr w:type="spellStart"/>
+            <w:r>
+              <w:t>ageDistribution</w:t>
+            </w:r>
+            <w:proofErr w:type="spellEnd"/>
+            <w:r>
+              <w:t>}</w:t>
             </w:r>
           </w:p>
         </w:tc>
@@ -898,6 +1146,7 @@
         <w:rPr>
           <w:sz w:val="20"/>
           <w:szCs w:val="20"/>
+          <w:lang w:val="en-GB"/>
         </w:rPr>
       </w:pPr>
     </w:p>
@@ -1052,7 +1301,23 @@
                 <w:sz w:val="20"/>
                 <w:szCs w:val="20"/>
               </w:rPr>
-              <w:t>${sleepingTaxes} CHF</w:t>
+              <w:t>${</w:t>
+            </w:r>
+            <w:proofErr w:type="spellStart"/>
+            <w:r>
+              <w:rPr>
+                <w:sz w:val="20"/>
+                <w:szCs w:val="20"/>
+              </w:rPr>
+              <w:t>sleepingTaxes</w:t>
+            </w:r>
+            <w:proofErr w:type="spellEnd"/>
+            <w:r>
+              <w:rPr>
+                <w:sz w:val="20"/>
+                <w:szCs w:val="20"/>
+              </w:rPr>
+              <w:t>} CHF</w:t>
             </w:r>
           </w:p>
         </w:tc>
@@ -1076,7 +1341,23 @@
                 <w:sz w:val="20"/>
                 <w:szCs w:val="20"/>
               </w:rPr>
-              <w:t>${sleepingTaxesText}</w:t>
+              <w:t>${</w:t>
+            </w:r>
+            <w:proofErr w:type="spellStart"/>
+            <w:r>
+              <w:rPr>
+                <w:sz w:val="20"/>
+                <w:szCs w:val="20"/>
+              </w:rPr>
+              <w:t>sleepingTaxesText</w:t>
+            </w:r>
+            <w:proofErr w:type="spellEnd"/>
+            <w:r>
+              <w:rPr>
+                <w:sz w:val="20"/>
+                <w:szCs w:val="20"/>
+              </w:rPr>
+              <w:t>}</w:t>
             </w:r>
           </w:p>
         </w:tc>
@@ -1134,7 +1415,23 @@
                 <w:sz w:val="20"/>
                 <w:szCs w:val="20"/>
               </w:rPr>
-              <w:t>${miscTaxes} CHF</w:t>
+              <w:t>${</w:t>
+            </w:r>
+            <w:proofErr w:type="spellStart"/>
+            <w:r>
+              <w:rPr>
+                <w:sz w:val="20"/>
+                <w:szCs w:val="20"/>
+              </w:rPr>
+              <w:t>miscTaxes</w:t>
+            </w:r>
+            <w:proofErr w:type="spellEnd"/>
+            <w:r>
+              <w:rPr>
+                <w:sz w:val="20"/>
+                <w:szCs w:val="20"/>
+              </w:rPr>
+              <w:t>} CHF</w:t>
             </w:r>
           </w:p>
         </w:tc>
@@ -1159,7 +1456,23 @@
                 <w:sz w:val="20"/>
                 <w:szCs w:val="20"/>
               </w:rPr>
-              <w:t>${miscTaxesText}</w:t>
+              <w:t>${</w:t>
+            </w:r>
+            <w:proofErr w:type="spellStart"/>
+            <w:r>
+              <w:rPr>
+                <w:sz w:val="20"/>
+                <w:szCs w:val="20"/>
+              </w:rPr>
+              <w:t>miscTaxesText</w:t>
+            </w:r>
+            <w:proofErr w:type="spellEnd"/>
+            <w:r>
+              <w:rPr>
+                <w:sz w:val="20"/>
+                <w:szCs w:val="20"/>
+              </w:rPr>
+              <w:t>}</w:t>
             </w:r>
           </w:p>
         </w:tc>
@@ -1257,12 +1570,21 @@
                 <w:szCs w:val="20"/>
               </w:rPr>
             </w:pPr>
-            <w:r>
-              <w:rPr>
-                <w:sz w:val="20"/>
-                <w:szCs w:val="20"/>
-              </w:rPr>
-              <w:t>Öv: Ha</w:t>
+            <w:proofErr w:type="spellStart"/>
+            <w:r>
+              <w:rPr>
+                <w:sz w:val="20"/>
+                <w:szCs w:val="20"/>
+              </w:rPr>
+              <w:t>Öv</w:t>
+            </w:r>
+            <w:proofErr w:type="spellEnd"/>
+            <w:r>
+              <w:rPr>
+                <w:sz w:val="20"/>
+                <w:szCs w:val="20"/>
+              </w:rPr>
+              <w:t>: Ha</w:t>
             </w:r>
             <w:r>
               <w:rPr>
@@ -1294,7 +1616,23 @@
                 <w:sz w:val="20"/>
                 <w:szCs w:val="20"/>
               </w:rPr>
-              <w:t>${railwTaxes}</w:t>
+              <w:t>${</w:t>
+            </w:r>
+            <w:proofErr w:type="spellStart"/>
+            <w:r>
+              <w:rPr>
+                <w:sz w:val="20"/>
+                <w:szCs w:val="20"/>
+              </w:rPr>
+              <w:t>railwTaxes</w:t>
+            </w:r>
+            <w:proofErr w:type="spellEnd"/>
+            <w:r>
+              <w:rPr>
+                <w:sz w:val="20"/>
+                <w:szCs w:val="20"/>
+              </w:rPr>
+              <w:t>}</w:t>
             </w:r>
             <w:r>
               <w:rPr>
@@ -1325,7 +1663,23 @@
                 <w:sz w:val="20"/>
                 <w:szCs w:val="20"/>
               </w:rPr>
-              <w:t>${railwTaxesText}</w:t>
+              <w:t>${</w:t>
+            </w:r>
+            <w:proofErr w:type="spellStart"/>
+            <w:r>
+              <w:rPr>
+                <w:sz w:val="20"/>
+                <w:szCs w:val="20"/>
+              </w:rPr>
+              <w:t>railwTaxesText</w:t>
+            </w:r>
+            <w:proofErr w:type="spellEnd"/>
+            <w:r>
+              <w:rPr>
+                <w:sz w:val="20"/>
+                <w:szCs w:val="20"/>
+              </w:rPr>
+              <w:t>}</w:t>
             </w:r>
           </w:p>
         </w:tc>
@@ -1378,7 +1732,15 @@
                 <w:sz w:val="20"/>
                 <w:szCs w:val="20"/>
               </w:rPr>
-              <w:t>${c</w:t>
+              <w:t>${</w:t>
+            </w:r>
+            <w:proofErr w:type="spellStart"/>
+            <w:r>
+              <w:rPr>
+                <w:sz w:val="20"/>
+                <w:szCs w:val="20"/>
+              </w:rPr>
+              <w:t>c</w:t>
             </w:r>
             <w:r>
               <w:rPr>
@@ -1392,7 +1754,15 @@
                 <w:sz w:val="20"/>
                 <w:szCs w:val="20"/>
               </w:rPr>
-              <w:t>CarTaxes}</w:t>
+              <w:t>CarTaxes</w:t>
+            </w:r>
+            <w:proofErr w:type="spellEnd"/>
+            <w:r>
+              <w:rPr>
+                <w:sz w:val="20"/>
+                <w:szCs w:val="20"/>
+              </w:rPr>
+              <w:t>}</w:t>
             </w:r>
             <w:r>
               <w:rPr>
@@ -1420,7 +1790,15 @@
                 <w:sz w:val="20"/>
                 <w:szCs w:val="20"/>
               </w:rPr>
-              <w:t>${ca</w:t>
+              <w:t>${</w:t>
+            </w:r>
+            <w:proofErr w:type="spellStart"/>
+            <w:r>
+              <w:rPr>
+                <w:sz w:val="20"/>
+                <w:szCs w:val="20"/>
+              </w:rPr>
+              <w:t>ca</w:t>
             </w:r>
             <w:r>
               <w:rPr>
@@ -1434,7 +1812,15 @@
                 <w:sz w:val="20"/>
                 <w:szCs w:val="20"/>
               </w:rPr>
-              <w:t>CarTaxesText}</w:t>
+              <w:t>CarTaxesText</w:t>
+            </w:r>
+            <w:proofErr w:type="spellEnd"/>
+            <w:r>
+              <w:rPr>
+                <w:sz w:val="20"/>
+                <w:szCs w:val="20"/>
+              </w:rPr>
+              <w:t>}</w:t>
             </w:r>
           </w:p>
         </w:tc>
@@ -1500,7 +1886,23 @@
                 <w:sz w:val="20"/>
                 <w:szCs w:val="20"/>
               </w:rPr>
-              <w:t>${carTaxes}</w:t>
+              <w:t>${</w:t>
+            </w:r>
+            <w:proofErr w:type="spellStart"/>
+            <w:r>
+              <w:rPr>
+                <w:sz w:val="20"/>
+                <w:szCs w:val="20"/>
+              </w:rPr>
+              <w:t>carTaxes</w:t>
+            </w:r>
+            <w:proofErr w:type="spellEnd"/>
+            <w:r>
+              <w:rPr>
+                <w:sz w:val="20"/>
+                <w:szCs w:val="20"/>
+              </w:rPr>
+              <w:t>}</w:t>
             </w:r>
             <w:r>
               <w:rPr>
@@ -1538,7 +1940,23 @@
                 <w:sz w:val="20"/>
                 <w:szCs w:val="20"/>
               </w:rPr>
-              <w:t>${carTaxesKm} km</w:t>
+              <w:t>${</w:t>
+            </w:r>
+            <w:proofErr w:type="spellStart"/>
+            <w:r>
+              <w:rPr>
+                <w:sz w:val="20"/>
+                <w:szCs w:val="20"/>
+              </w:rPr>
+              <w:t>carTaxesKm</w:t>
+            </w:r>
+            <w:proofErr w:type="spellEnd"/>
+            <w:r>
+              <w:rPr>
+                <w:sz w:val="20"/>
+                <w:szCs w:val="20"/>
+              </w:rPr>
+              <w:t>} km</w:t>
             </w:r>
           </w:p>
           <w:p>
@@ -1603,7 +2021,23 @@
                 <w:sz w:val="20"/>
                 <w:szCs w:val="20"/>
               </w:rPr>
-              <w:t>${roadTaxes}</w:t>
+              <w:t>${</w:t>
+            </w:r>
+            <w:proofErr w:type="spellStart"/>
+            <w:r>
+              <w:rPr>
+                <w:sz w:val="20"/>
+                <w:szCs w:val="20"/>
+              </w:rPr>
+              <w:t>roadTaxes</w:t>
+            </w:r>
+            <w:proofErr w:type="spellEnd"/>
+            <w:r>
+              <w:rPr>
+                <w:sz w:val="20"/>
+                <w:szCs w:val="20"/>
+              </w:rPr>
+              <w:t>}</w:t>
             </w:r>
             <w:r>
               <w:rPr>
@@ -1640,7 +2074,23 @@
                 <w:sz w:val="20"/>
                 <w:szCs w:val="20"/>
               </w:rPr>
-              <w:t>${countCars}</w:t>
+              <w:t>${</w:t>
+            </w:r>
+            <w:proofErr w:type="spellStart"/>
+            <w:r>
+              <w:rPr>
+                <w:sz w:val="20"/>
+                <w:szCs w:val="20"/>
+              </w:rPr>
+              <w:t>countCars</w:t>
+            </w:r>
+            <w:proofErr w:type="spellEnd"/>
+            <w:r>
+              <w:rPr>
+                <w:sz w:val="20"/>
+                <w:szCs w:val="20"/>
+              </w:rPr>
+              <w:t>}</w:t>
             </w:r>
           </w:p>
           <w:p>
@@ -1670,7 +2120,23 @@
                 <w:sz w:val="20"/>
                 <w:szCs w:val="20"/>
               </w:rPr>
-              <w:t>: ${privateArrival}</w:t>
+              <w:t>: ${</w:t>
+            </w:r>
+            <w:proofErr w:type="spellStart"/>
+            <w:r>
+              <w:rPr>
+                <w:sz w:val="20"/>
+                <w:szCs w:val="20"/>
+              </w:rPr>
+              <w:t>privateArrival</w:t>
+            </w:r>
+            <w:proofErr w:type="spellEnd"/>
+            <w:r>
+              <w:rPr>
+                <w:sz w:val="20"/>
+                <w:szCs w:val="20"/>
+              </w:rPr>
+              <w:t>}</w:t>
             </w:r>
           </w:p>
         </w:tc>
@@ -1759,6 +2225,7 @@
               </w:rPr>
               <w:t>${</w:t>
             </w:r>
+            <w:proofErr w:type="spellStart"/>
             <w:r>
               <w:rPr>
                 <w:sz w:val="20"/>
@@ -1766,6 +2233,7 @@
               </w:rPr>
               <w:t>expenseReimbursement</w:t>
             </w:r>
+            <w:proofErr w:type="spellEnd"/>
             <w:r>
               <w:rPr>
                 <w:sz w:val="20"/>
@@ -1897,6 +2365,7 @@
               </w:rPr>
               <w:t>${</w:t>
             </w:r>
+            <w:proofErr w:type="spellStart"/>
             <w:r>
               <w:rPr>
                 <w:sz w:val="20"/>
@@ -1904,6 +2373,7 @@
               </w:rPr>
               <w:t>organizationalFlatRate</w:t>
             </w:r>
+            <w:proofErr w:type="spellEnd"/>
             <w:r>
               <w:rPr>
                 <w:sz w:val="20"/>
@@ -1995,7 +2465,23 @@
                 <w:sz w:val="20"/>
                 <w:szCs w:val="20"/>
               </w:rPr>
-              <w:t>${revenueForSection} CHF</w:t>
+              <w:t>${</w:t>
+            </w:r>
+            <w:proofErr w:type="spellStart"/>
+            <w:r>
+              <w:rPr>
+                <w:sz w:val="20"/>
+                <w:szCs w:val="20"/>
+              </w:rPr>
+              <w:t>revenueForSection</w:t>
+            </w:r>
+            <w:proofErr w:type="spellEnd"/>
+            <w:r>
+              <w:rPr>
+                <w:sz w:val="20"/>
+                <w:szCs w:val="20"/>
+              </w:rPr>
+              <w:t>} CHF</w:t>
             </w:r>
           </w:p>
         </w:tc>
@@ -2020,7 +2506,23 @@
                 <w:sz w:val="20"/>
                 <w:szCs w:val="20"/>
               </w:rPr>
-              <w:t>${revenueForSectionInfoText}</w:t>
+              <w:t>${</w:t>
+            </w:r>
+            <w:proofErr w:type="spellStart"/>
+            <w:r>
+              <w:rPr>
+                <w:sz w:val="20"/>
+                <w:szCs w:val="20"/>
+              </w:rPr>
+              <w:t>revenueForSectionInfoText</w:t>
+            </w:r>
+            <w:proofErr w:type="spellEnd"/>
+            <w:r>
+              <w:rPr>
+                <w:sz w:val="20"/>
+                <w:szCs w:val="20"/>
+              </w:rPr>
+              <w:t>}</w:t>
             </w:r>
           </w:p>
         </w:tc>
@@ -2080,7 +2582,25 @@
                 <w:sz w:val="20"/>
                 <w:szCs w:val="20"/>
               </w:rPr>
-              <w:t>${totalCosts} CHF</w:t>
+              <w:t>${</w:t>
+            </w:r>
+            <w:proofErr w:type="spellStart"/>
+            <w:r>
+              <w:rPr>
+                <w:b/>
+                <w:sz w:val="20"/>
+                <w:szCs w:val="20"/>
+              </w:rPr>
+              <w:t>totalCosts</w:t>
+            </w:r>
+            <w:proofErr w:type="spellEnd"/>
+            <w:r>
+              <w:rPr>
+                <w:b/>
+                <w:sz w:val="20"/>
+                <w:szCs w:val="20"/>
+              </w:rPr>
+              <w:t>} CHF</w:t>
             </w:r>
           </w:p>
         </w:tc>
@@ -2159,7 +2679,31 @@
           <w:sz w:val="20"/>
           <w:szCs w:val="20"/>
         </w:rPr>
-        <w:t xml:space="preserve"> x AnzKm + Park-/Strassen-/Tunnelgebühren) x Anz</w:t>
+        <w:t xml:space="preserve"> x </w:t>
+      </w:r>
+      <w:proofErr w:type="spellStart"/>
+      <w:r>
+        <w:rPr>
+          <w:sz w:val="20"/>
+          <w:szCs w:val="20"/>
+        </w:rPr>
+        <w:t>AnzKm</w:t>
+      </w:r>
+      <w:proofErr w:type="spellEnd"/>
+      <w:r>
+        <w:rPr>
+          <w:sz w:val="20"/>
+          <w:szCs w:val="20"/>
+        </w:rPr>
+        <w:t xml:space="preserve"> + Park-/Strassen-/Tunnelgebühren) x </w:t>
+      </w:r>
+      <w:proofErr w:type="spellStart"/>
+      <w:r>
+        <w:rPr>
+          <w:sz w:val="20"/>
+          <w:szCs w:val="20"/>
+        </w:rPr>
+        <w:t>Anz</w:t>
       </w:r>
       <w:r>
         <w:rPr>
@@ -2173,8 +2717,25 @@
           <w:sz w:val="20"/>
           <w:szCs w:val="20"/>
         </w:rPr>
-        <w:t>s) : AnzPersonen</w:t>
+        <w:t>s</w:t>
       </w:r>
+      <w:proofErr w:type="spellEnd"/>
+      <w:r>
+        <w:rPr>
+          <w:sz w:val="20"/>
+          <w:szCs w:val="20"/>
+        </w:rPr>
+        <w:t xml:space="preserve">) : </w:t>
+      </w:r>
+      <w:proofErr w:type="spellStart"/>
+      <w:r>
+        <w:rPr>
+          <w:sz w:val="20"/>
+          <w:szCs w:val="20"/>
+        </w:rPr>
+        <w:t>AnzPersonen</w:t>
+      </w:r>
+      <w:proofErr w:type="spellEnd"/>
       <w:r>
         <w:rPr>
           <w:sz w:val="20"/>
@@ -2204,7 +2765,23 @@
           <w:szCs w:val="20"/>
         </w:rPr>
         <w:br/>
-        <w:t>${notice}</w:t>
+        <w:t>${</w:t>
+      </w:r>
+      <w:proofErr w:type="spellStart"/>
+      <w:r>
+        <w:rPr>
+          <w:sz w:val="20"/>
+          <w:szCs w:val="20"/>
+        </w:rPr>
+        <w:t>notice</w:t>
+      </w:r>
+      <w:proofErr w:type="spellEnd"/>
+      <w:r>
+        <w:rPr>
+          <w:sz w:val="20"/>
+          <w:szCs w:val="20"/>
+        </w:rPr>
+        <w:t>}</w:t>
       </w:r>
     </w:p>
     <w:p>
@@ -2266,7 +2843,23 @@
                 <w:sz w:val="20"/>
                 <w:szCs w:val="20"/>
               </w:rPr>
-              <w:t>IBAN: ${iban}</w:t>
+              <w:t>IBAN: ${</w:t>
+            </w:r>
+            <w:proofErr w:type="spellStart"/>
+            <w:r>
+              <w:rPr>
+                <w:sz w:val="20"/>
+                <w:szCs w:val="20"/>
+              </w:rPr>
+              <w:t>iban</w:t>
+            </w:r>
+            <w:proofErr w:type="spellEnd"/>
+            <w:r>
+              <w:rPr>
+                <w:sz w:val="20"/>
+                <w:szCs w:val="20"/>
+              </w:rPr>
+              <w:t>}</w:t>
             </w:r>
           </w:p>
         </w:tc>
@@ -2313,7 +2906,23 @@
                 <w:sz w:val="20"/>
                 <w:szCs w:val="20"/>
               </w:rPr>
-              <w:t>${accountHolder}</w:t>
+              <w:t>${</w:t>
+            </w:r>
+            <w:proofErr w:type="spellStart"/>
+            <w:r>
+              <w:rPr>
+                <w:sz w:val="20"/>
+                <w:szCs w:val="20"/>
+              </w:rPr>
+              <w:t>accountHolder</w:t>
+            </w:r>
+            <w:proofErr w:type="spellEnd"/>
+            <w:r>
+              <w:rPr>
+                <w:sz w:val="20"/>
+                <w:szCs w:val="20"/>
+              </w:rPr>
+              <w:t>}</w:t>
             </w:r>
           </w:p>
         </w:tc>
@@ -2366,7 +2975,23 @@
           <w:sz w:val="20"/>
           <w:szCs w:val="20"/>
         </w:rPr>
-        <w:t>: ${printingDate}</w:t>
+        <w:t>: ${</w:t>
+      </w:r>
+      <w:proofErr w:type="spellStart"/>
+      <w:r>
+        <w:rPr>
+          <w:sz w:val="20"/>
+          <w:szCs w:val="20"/>
+        </w:rPr>
+        <w:t>printingDate</w:t>
+      </w:r>
+      <w:proofErr w:type="spellEnd"/>
+      <w:r>
+        <w:rPr>
+          <w:sz w:val="20"/>
+          <w:szCs w:val="20"/>
+        </w:rPr>
+        <w:t>}</w:t>
       </w:r>
     </w:p>
     <w:sectPr>
@@ -3218,7 +3843,6 @@
   <w:style w:type="character" w:default="1" w:styleId="Absatz-Standardschriftart">
     <w:name w:val="Default Paragraph Font"/>
     <w:uiPriority w:val="1"/>
-    <w:semiHidden/>
     <w:unhideWhenUsed/>
   </w:style>
   <w:style w:type="table" w:default="1" w:styleId="NormaleTabelle">

</xml_diff>